<commit_message>
Cập nhật bài mới
</commit_message>
<xml_diff>
--- a/CÁC ĐỀ THI/Chủ đề 1. THUẬT TOÁN SINH.docx
+++ b/CÁC ĐỀ THI/Chủ đề 1. THUẬT TOÁN SINH.docx
@@ -23,7 +23,17 @@
           <w:sz w:val="26"/>
           <w:szCs w:val="26"/>
         </w:rPr>
-        <w:t>NGÂN HÀNG CÂU HỎI THI THỰC HÀNH TRÊN NỀN TẢNG Code PTIT Client</w:t>
+        <w:t xml:space="preserve">NGÂN HÀNG CÂU HỎI THI </w:t>
+      </w:r>
+      <w:r>
+        <w:rPr>
+          <w:rFonts w:ascii="Times New Roman" w:hAnsi="Times New Roman" w:cs="Times New Roman"/>
+          <w:b/>
+          <w:bCs/>
+          <w:sz w:val="26"/>
+          <w:szCs w:val="26"/>
+        </w:rPr>
+        <w:t>KẾT THÚC HỌC PHẦN TRÊN CODE PTIT CLIENT</w:t>
       </w:r>
     </w:p>
     <w:p>
@@ -101,7 +111,7 @@
           <w:sz w:val="26"/>
           <w:szCs w:val="26"/>
         </w:rPr>
-        <w:t xml:space="preserve">(Cập nhật ngày </w:t>
+        <w:t xml:space="preserve">(Cập nhật </w:t>
       </w:r>
       <w:r>
         <w:rPr>
@@ -113,7 +123,43 @@
           <w:sz w:val="26"/>
           <w:szCs w:val="26"/>
         </w:rPr>
-        <w:t>04</w:t>
+        <w:t xml:space="preserve">lần cuối </w:t>
+      </w:r>
+      <w:r>
+        <w:rPr>
+          <w:rFonts w:ascii="Times New Roman" w:hAnsi="Times New Roman" w:cs="Times New Roman"/>
+          <w:b/>
+          <w:bCs/>
+          <w:i/>
+          <w:iCs/>
+          <w:sz w:val="26"/>
+          <w:szCs w:val="26"/>
+        </w:rPr>
+        <w:t xml:space="preserve">ngày </w:t>
+      </w:r>
+      <w:r>
+        <w:rPr>
+          <w:rFonts w:ascii="Times New Roman" w:hAnsi="Times New Roman" w:cs="Times New Roman"/>
+          <w:b/>
+          <w:bCs/>
+          <w:i/>
+          <w:iCs/>
+          <w:sz w:val="26"/>
+          <w:szCs w:val="26"/>
+        </w:rPr>
+        <w:t>0</w:t>
+      </w:r>
+      <w:r>
+        <w:rPr>
+          <w:rFonts w:ascii="Times New Roman" w:hAnsi="Times New Roman" w:cs="Times New Roman"/>
+          <w:b/>
+          <w:bCs/>
+          <w:i/>
+          <w:iCs/>
+          <w:sz w:val="26"/>
+          <w:szCs w:val="26"/>
+        </w:rPr>
+        <w:t>7</w:t>
       </w:r>
       <w:r>
         <w:rPr>
@@ -733,7 +779,7 @@
             </w:rPr>
             <w:fldChar w:fldCharType="separate"/>
           </w:r>
-          <w:hyperlink w:anchor="_Toc226205026" w:history="1">
+          <w:hyperlink w:anchor="_Toc226470151" w:history="1">
             <w:r>
               <w:rPr>
                 <w:rStyle w:val="Hyperlink"/>
@@ -774,7 +820,7 @@
                 <w:sz w:val="26"/>
                 <w:szCs w:val="26"/>
               </w:rPr>
-              <w:instrText xml:space="preserve"> PAGEREF _Toc226205026 \h </w:instrText>
+              <w:instrText xml:space="preserve"> PAGEREF _Toc226470151 \h </w:instrText>
             </w:r>
             <w:r>
               <w:rPr>
@@ -831,7 +877,7 @@
               <w:szCs w:val="26"/>
             </w:rPr>
           </w:pPr>
-          <w:hyperlink w:anchor="_Toc226205027" w:history="1">
+          <w:hyperlink w:anchor="_Toc226470152" w:history="1">
             <w:r>
               <w:rPr>
                 <w:rStyle w:val="Hyperlink"/>
@@ -872,7 +918,7 @@
                 <w:sz w:val="26"/>
                 <w:szCs w:val="26"/>
               </w:rPr>
-              <w:instrText xml:space="preserve"> PAGEREF _Toc226205027 \h </w:instrText>
+              <w:instrText xml:space="preserve"> PAGEREF _Toc226470152 \h </w:instrText>
             </w:r>
             <w:r>
               <w:rPr>
@@ -929,7 +975,7 @@
               <w:szCs w:val="26"/>
             </w:rPr>
           </w:pPr>
-          <w:hyperlink w:anchor="_Toc226205028" w:history="1">
+          <w:hyperlink w:anchor="_Toc226470153" w:history="1">
             <w:r>
               <w:rPr>
                 <w:rStyle w:val="Hyperlink"/>
@@ -970,7 +1016,7 @@
                 <w:sz w:val="26"/>
                 <w:szCs w:val="26"/>
               </w:rPr>
-              <w:instrText xml:space="preserve"> PAGEREF _Toc226205028 \h </w:instrText>
+              <w:instrText xml:space="preserve"> PAGEREF _Toc226470153 \h </w:instrText>
             </w:r>
             <w:r>
               <w:rPr>
@@ -1027,7 +1073,7 @@
               <w:szCs w:val="26"/>
             </w:rPr>
           </w:pPr>
-          <w:hyperlink w:anchor="_Toc226205029" w:history="1">
+          <w:hyperlink w:anchor="_Toc226470154" w:history="1">
             <w:r>
               <w:rPr>
                 <w:rStyle w:val="Hyperlink"/>
@@ -1068,7 +1114,7 @@
                 <w:sz w:val="26"/>
                 <w:szCs w:val="26"/>
               </w:rPr>
-              <w:instrText xml:space="preserve"> PAGEREF _Toc226205029 \h </w:instrText>
+              <w:instrText xml:space="preserve"> PAGEREF _Toc226470154 \h </w:instrText>
             </w:r>
             <w:r>
               <w:rPr>
@@ -1125,7 +1171,7 @@
               <w:szCs w:val="26"/>
             </w:rPr>
           </w:pPr>
-          <w:hyperlink w:anchor="_Toc226205030" w:history="1">
+          <w:hyperlink w:anchor="_Toc226470155" w:history="1">
             <w:r>
               <w:rPr>
                 <w:rStyle w:val="Hyperlink"/>
@@ -1166,7 +1212,7 @@
                 <w:sz w:val="26"/>
                 <w:szCs w:val="26"/>
               </w:rPr>
-              <w:instrText xml:space="preserve"> PAGEREF _Toc226205030 \h </w:instrText>
+              <w:instrText xml:space="preserve"> PAGEREF _Toc226470155 \h </w:instrText>
             </w:r>
             <w:r>
               <w:rPr>
@@ -1223,7 +1269,7 @@
               <w:szCs w:val="26"/>
             </w:rPr>
           </w:pPr>
-          <w:hyperlink w:anchor="_Toc226205031" w:history="1">
+          <w:hyperlink w:anchor="_Toc226470156" w:history="1">
             <w:r>
               <w:rPr>
                 <w:rStyle w:val="Hyperlink"/>
@@ -1264,7 +1310,7 @@
                 <w:sz w:val="26"/>
                 <w:szCs w:val="26"/>
               </w:rPr>
-              <w:instrText xml:space="preserve"> PAGEREF _Toc226205031 \h </w:instrText>
+              <w:instrText xml:space="preserve"> PAGEREF _Toc226470156 \h </w:instrText>
             </w:r>
             <w:r>
               <w:rPr>
@@ -1321,7 +1367,7 @@
               <w:szCs w:val="26"/>
             </w:rPr>
           </w:pPr>
-          <w:hyperlink w:anchor="_Toc226205032" w:history="1">
+          <w:hyperlink w:anchor="_Toc226470157" w:history="1">
             <w:r>
               <w:rPr>
                 <w:rStyle w:val="Hyperlink"/>
@@ -1362,7 +1408,7 @@
                 <w:sz w:val="26"/>
                 <w:szCs w:val="26"/>
               </w:rPr>
-              <w:instrText xml:space="preserve"> PAGEREF _Toc226205032 \h </w:instrText>
+              <w:instrText xml:space="preserve"> PAGEREF _Toc226470157 \h </w:instrText>
             </w:r>
             <w:r>
               <w:rPr>
@@ -1419,7 +1465,7 @@
               <w:szCs w:val="26"/>
             </w:rPr>
           </w:pPr>
-          <w:hyperlink w:anchor="_Toc226205033" w:history="1">
+          <w:hyperlink w:anchor="_Toc226470158" w:history="1">
             <w:r>
               <w:rPr>
                 <w:rStyle w:val="Hyperlink"/>
@@ -1460,7 +1506,7 @@
                 <w:sz w:val="26"/>
                 <w:szCs w:val="26"/>
               </w:rPr>
-              <w:instrText xml:space="preserve"> PAGEREF _Toc226205033 \h </w:instrText>
+              <w:instrText xml:space="preserve"> PAGEREF _Toc226470158 \h </w:instrText>
             </w:r>
             <w:r>
               <w:rPr>
@@ -1517,7 +1563,7 @@
               <w:szCs w:val="26"/>
             </w:rPr>
           </w:pPr>
-          <w:hyperlink w:anchor="_Toc226205034" w:history="1">
+          <w:hyperlink w:anchor="_Toc226470159" w:history="1">
             <w:r>
               <w:rPr>
                 <w:rStyle w:val="Hyperlink"/>
@@ -1558,7 +1604,7 @@
                 <w:sz w:val="26"/>
                 <w:szCs w:val="26"/>
               </w:rPr>
-              <w:instrText xml:space="preserve"> PAGEREF _Toc226205034 \h </w:instrText>
+              <w:instrText xml:space="preserve"> PAGEREF _Toc226470159 \h </w:instrText>
             </w:r>
             <w:r>
               <w:rPr>
@@ -1615,7 +1661,7 @@
               <w:szCs w:val="26"/>
             </w:rPr>
           </w:pPr>
-          <w:hyperlink w:anchor="_Toc226205035" w:history="1">
+          <w:hyperlink w:anchor="_Toc226470160" w:history="1">
             <w:r>
               <w:rPr>
                 <w:rStyle w:val="Hyperlink"/>
@@ -1656,7 +1702,7 @@
                 <w:sz w:val="26"/>
                 <w:szCs w:val="26"/>
               </w:rPr>
-              <w:instrText xml:space="preserve"> PAGEREF _Toc226205035 \h </w:instrText>
+              <w:instrText xml:space="preserve"> PAGEREF _Toc226470160 \h </w:instrText>
             </w:r>
             <w:r>
               <w:rPr>
@@ -1713,7 +1759,7 @@
               <w:szCs w:val="26"/>
             </w:rPr>
           </w:pPr>
-          <w:hyperlink w:anchor="_Toc226205036" w:history="1">
+          <w:hyperlink w:anchor="_Toc226470161" w:history="1">
             <w:r>
               <w:rPr>
                 <w:rStyle w:val="Hyperlink"/>
@@ -1754,7 +1800,7 @@
                 <w:sz w:val="26"/>
                 <w:szCs w:val="26"/>
               </w:rPr>
-              <w:instrText xml:space="preserve"> PAGEREF _Toc226205036 \h </w:instrText>
+              <w:instrText xml:space="preserve"> PAGEREF _Toc226470161 \h </w:instrText>
             </w:r>
             <w:r>
               <w:rPr>
@@ -1811,7 +1857,7 @@
               <w:szCs w:val="26"/>
             </w:rPr>
           </w:pPr>
-          <w:hyperlink w:anchor="_Toc226205037" w:history="1">
+          <w:hyperlink w:anchor="_Toc226470162" w:history="1">
             <w:r>
               <w:rPr>
                 <w:rStyle w:val="Hyperlink"/>
@@ -1852,7 +1898,7 @@
                 <w:sz w:val="26"/>
                 <w:szCs w:val="26"/>
               </w:rPr>
-              <w:instrText xml:space="preserve"> PAGEREF _Toc226205037 \h </w:instrText>
+              <w:instrText xml:space="preserve"> PAGEREF _Toc226470162 \h </w:instrText>
             </w:r>
             <w:r>
               <w:rPr>
@@ -1909,7 +1955,7 @@
               <w:szCs w:val="26"/>
             </w:rPr>
           </w:pPr>
-          <w:hyperlink w:anchor="_Toc226205038" w:history="1">
+          <w:hyperlink w:anchor="_Toc226470163" w:history="1">
             <w:r>
               <w:rPr>
                 <w:rStyle w:val="Hyperlink"/>
@@ -1950,7 +1996,7 @@
                 <w:sz w:val="26"/>
                 <w:szCs w:val="26"/>
               </w:rPr>
-              <w:instrText xml:space="preserve"> PAGEREF _Toc226205038 \h </w:instrText>
+              <w:instrText xml:space="preserve"> PAGEREF _Toc226470163 \h </w:instrText>
             </w:r>
             <w:r>
               <w:rPr>
@@ -2007,7 +2053,7 @@
               <w:szCs w:val="26"/>
             </w:rPr>
           </w:pPr>
-          <w:hyperlink w:anchor="_Toc226205039" w:history="1">
+          <w:hyperlink w:anchor="_Toc226470164" w:history="1">
             <w:r>
               <w:rPr>
                 <w:rStyle w:val="Hyperlink"/>
@@ -2048,7 +2094,7 @@
                 <w:sz w:val="26"/>
                 <w:szCs w:val="26"/>
               </w:rPr>
-              <w:instrText xml:space="preserve"> PAGEREF _Toc226205039 \h </w:instrText>
+              <w:instrText xml:space="preserve"> PAGEREF _Toc226470164 \h </w:instrText>
             </w:r>
             <w:r>
               <w:rPr>
@@ -2105,7 +2151,7 @@
               <w:szCs w:val="26"/>
             </w:rPr>
           </w:pPr>
-          <w:hyperlink w:anchor="_Toc226205040" w:history="1">
+          <w:hyperlink w:anchor="_Toc226470165" w:history="1">
             <w:r>
               <w:rPr>
                 <w:rStyle w:val="Hyperlink"/>
@@ -2146,7 +2192,7 @@
                 <w:sz w:val="26"/>
                 <w:szCs w:val="26"/>
               </w:rPr>
-              <w:instrText xml:space="preserve"> PAGEREF _Toc226205040 \h </w:instrText>
+              <w:instrText xml:space="preserve"> PAGEREF _Toc226470165 \h </w:instrText>
             </w:r>
             <w:r>
               <w:rPr>
@@ -2203,7 +2249,7 @@
               <w:szCs w:val="26"/>
             </w:rPr>
           </w:pPr>
-          <w:hyperlink w:anchor="_Toc226205041" w:history="1">
+          <w:hyperlink w:anchor="_Toc226470166" w:history="1">
             <w:r>
               <w:rPr>
                 <w:rStyle w:val="Hyperlink"/>
@@ -2244,7 +2290,7 @@
                 <w:sz w:val="26"/>
                 <w:szCs w:val="26"/>
               </w:rPr>
-              <w:instrText xml:space="preserve"> PAGEREF _Toc226205041 \h </w:instrText>
+              <w:instrText xml:space="preserve"> PAGEREF _Toc226470166 \h </w:instrText>
             </w:r>
             <w:r>
               <w:rPr>
@@ -2301,7 +2347,7 @@
               <w:szCs w:val="26"/>
             </w:rPr>
           </w:pPr>
-          <w:hyperlink w:anchor="_Toc226205042" w:history="1">
+          <w:hyperlink w:anchor="_Toc226470167" w:history="1">
             <w:r>
               <w:rPr>
                 <w:rStyle w:val="Hyperlink"/>
@@ -2342,7 +2388,7 @@
                 <w:sz w:val="26"/>
                 <w:szCs w:val="26"/>
               </w:rPr>
-              <w:instrText xml:space="preserve"> PAGEREF _Toc226205042 \h </w:instrText>
+              <w:instrText xml:space="preserve"> PAGEREF _Toc226470167 \h </w:instrText>
             </w:r>
             <w:r>
               <w:rPr>
@@ -2399,7 +2445,7 @@
               <w:szCs w:val="26"/>
             </w:rPr>
           </w:pPr>
-          <w:hyperlink w:anchor="_Toc226205043" w:history="1">
+          <w:hyperlink w:anchor="_Toc226470168" w:history="1">
             <w:r>
               <w:rPr>
                 <w:rStyle w:val="Hyperlink"/>
@@ -2440,7 +2486,7 @@
                 <w:sz w:val="26"/>
                 <w:szCs w:val="26"/>
               </w:rPr>
-              <w:instrText xml:space="preserve"> PAGEREF _Toc226205043 \h </w:instrText>
+              <w:instrText xml:space="preserve"> PAGEREF _Toc226470168 \h </w:instrText>
             </w:r>
             <w:r>
               <w:rPr>
@@ -2497,7 +2543,7 @@
               <w:szCs w:val="26"/>
             </w:rPr>
           </w:pPr>
-          <w:hyperlink w:anchor="_Toc226205044" w:history="1">
+          <w:hyperlink w:anchor="_Toc226470169" w:history="1">
             <w:r>
               <w:rPr>
                 <w:rStyle w:val="Hyperlink"/>
@@ -2538,7 +2584,7 @@
                 <w:sz w:val="26"/>
                 <w:szCs w:val="26"/>
               </w:rPr>
-              <w:instrText xml:space="preserve"> PAGEREF _Toc226205044 \h </w:instrText>
+              <w:instrText xml:space="preserve"> PAGEREF _Toc226470169 \h </w:instrText>
             </w:r>
             <w:r>
               <w:rPr>
@@ -2595,7 +2641,7 @@
               <w:szCs w:val="26"/>
             </w:rPr>
           </w:pPr>
-          <w:hyperlink w:anchor="_Toc226205045" w:history="1">
+          <w:hyperlink w:anchor="_Toc226470170" w:history="1">
             <w:r>
               <w:rPr>
                 <w:rStyle w:val="Hyperlink"/>
@@ -2636,7 +2682,7 @@
                 <w:sz w:val="26"/>
                 <w:szCs w:val="26"/>
               </w:rPr>
-              <w:instrText xml:space="preserve"> PAGEREF _Toc226205045 \h </w:instrText>
+              <w:instrText xml:space="preserve"> PAGEREF _Toc226470170 \h </w:instrText>
             </w:r>
             <w:r>
               <w:rPr>
@@ -2693,7 +2739,7 @@
               <w:szCs w:val="26"/>
             </w:rPr>
           </w:pPr>
-          <w:hyperlink w:anchor="_Toc226205046" w:history="1">
+          <w:hyperlink w:anchor="_Toc226470171" w:history="1">
             <w:r>
               <w:rPr>
                 <w:rStyle w:val="Hyperlink"/>
@@ -2734,7 +2780,7 @@
                 <w:sz w:val="26"/>
                 <w:szCs w:val="26"/>
               </w:rPr>
-              <w:instrText xml:space="preserve"> PAGEREF _Toc226205046 \h </w:instrText>
+              <w:instrText xml:space="preserve"> PAGEREF _Toc226470171 \h </w:instrText>
             </w:r>
             <w:r>
               <w:rPr>
@@ -2791,7 +2837,7 @@
               <w:szCs w:val="26"/>
             </w:rPr>
           </w:pPr>
-          <w:hyperlink w:anchor="_Toc226205047" w:history="1">
+          <w:hyperlink w:anchor="_Toc226470172" w:history="1">
             <w:r>
               <w:rPr>
                 <w:rStyle w:val="Hyperlink"/>
@@ -2832,7 +2878,7 @@
                 <w:sz w:val="26"/>
                 <w:szCs w:val="26"/>
               </w:rPr>
-              <w:instrText xml:space="preserve"> PAGEREF _Toc226205047 \h </w:instrText>
+              <w:instrText xml:space="preserve"> PAGEREF _Toc226470172 \h </w:instrText>
             </w:r>
             <w:r>
               <w:rPr>
@@ -2889,7 +2935,7 @@
               <w:szCs w:val="26"/>
             </w:rPr>
           </w:pPr>
-          <w:hyperlink w:anchor="_Toc226205048" w:history="1">
+          <w:hyperlink w:anchor="_Toc226470173" w:history="1">
             <w:r>
               <w:rPr>
                 <w:rStyle w:val="Hyperlink"/>
@@ -2930,7 +2976,7 @@
                 <w:sz w:val="26"/>
                 <w:szCs w:val="26"/>
               </w:rPr>
-              <w:instrText xml:space="preserve"> PAGEREF _Toc226205048 \h </w:instrText>
+              <w:instrText xml:space="preserve"> PAGEREF _Toc226470173 \h </w:instrText>
             </w:r>
             <w:r>
               <w:rPr>
@@ -2987,7 +3033,7 @@
               <w:szCs w:val="26"/>
             </w:rPr>
           </w:pPr>
-          <w:hyperlink w:anchor="_Toc226205049" w:history="1">
+          <w:hyperlink w:anchor="_Toc226470174" w:history="1">
             <w:r>
               <w:rPr>
                 <w:rStyle w:val="Hyperlink"/>
@@ -3028,7 +3074,7 @@
                 <w:sz w:val="26"/>
                 <w:szCs w:val="26"/>
               </w:rPr>
-              <w:instrText xml:space="preserve"> PAGEREF _Toc226205049 \h </w:instrText>
+              <w:instrText xml:space="preserve"> PAGEREF _Toc226470174 \h </w:instrText>
             </w:r>
             <w:r>
               <w:rPr>
@@ -3085,7 +3131,7 @@
               <w:szCs w:val="26"/>
             </w:rPr>
           </w:pPr>
-          <w:hyperlink w:anchor="_Toc226205050" w:history="1">
+          <w:hyperlink w:anchor="_Toc226470175" w:history="1">
             <w:r>
               <w:rPr>
                 <w:rStyle w:val="Hyperlink"/>
@@ -3126,7 +3172,7 @@
                 <w:sz w:val="26"/>
                 <w:szCs w:val="26"/>
               </w:rPr>
-              <w:instrText xml:space="preserve"> PAGEREF _Toc226205050 \h </w:instrText>
+              <w:instrText xml:space="preserve"> PAGEREF _Toc226470175 \h </w:instrText>
             </w:r>
             <w:r>
               <w:rPr>
@@ -3183,7 +3229,7 @@
               <w:szCs w:val="26"/>
             </w:rPr>
           </w:pPr>
-          <w:hyperlink w:anchor="_Toc226205051" w:history="1">
+          <w:hyperlink w:anchor="_Toc226470176" w:history="1">
             <w:r>
               <w:rPr>
                 <w:rStyle w:val="Hyperlink"/>
@@ -3224,7 +3270,7 @@
                 <w:sz w:val="26"/>
                 <w:szCs w:val="26"/>
               </w:rPr>
-              <w:instrText xml:space="preserve"> PAGEREF _Toc226205051 \h </w:instrText>
+              <w:instrText xml:space="preserve"> PAGEREF _Toc226470176 \h </w:instrText>
             </w:r>
             <w:r>
               <w:rPr>
@@ -3281,7 +3327,7 @@
               <w:szCs w:val="26"/>
             </w:rPr>
           </w:pPr>
-          <w:hyperlink w:anchor="_Toc226205052" w:history="1">
+          <w:hyperlink w:anchor="_Toc226470177" w:history="1">
             <w:r>
               <w:rPr>
                 <w:rStyle w:val="Hyperlink"/>
@@ -3322,7 +3368,7 @@
                 <w:sz w:val="26"/>
                 <w:szCs w:val="26"/>
               </w:rPr>
-              <w:instrText xml:space="preserve"> PAGEREF _Toc226205052 \h </w:instrText>
+              <w:instrText xml:space="preserve"> PAGEREF _Toc226470177 \h </w:instrText>
             </w:r>
             <w:r>
               <w:rPr>
@@ -3379,7 +3425,7 @@
               <w:szCs w:val="26"/>
             </w:rPr>
           </w:pPr>
-          <w:hyperlink w:anchor="_Toc226205053" w:history="1">
+          <w:hyperlink w:anchor="_Toc226470178" w:history="1">
             <w:r>
               <w:rPr>
                 <w:rStyle w:val="Hyperlink"/>
@@ -3420,7 +3466,7 @@
                 <w:sz w:val="26"/>
                 <w:szCs w:val="26"/>
               </w:rPr>
-              <w:instrText xml:space="preserve"> PAGEREF _Toc226205053 \h </w:instrText>
+              <w:instrText xml:space="preserve"> PAGEREF _Toc226470178 \h </w:instrText>
             </w:r>
             <w:r>
               <w:rPr>
@@ -3477,7 +3523,7 @@
               <w:szCs w:val="26"/>
             </w:rPr>
           </w:pPr>
-          <w:hyperlink w:anchor="_Toc226205054" w:history="1">
+          <w:hyperlink w:anchor="_Toc226470179" w:history="1">
             <w:r>
               <w:rPr>
                 <w:rStyle w:val="Hyperlink"/>
@@ -3518,7 +3564,7 @@
                 <w:sz w:val="26"/>
                 <w:szCs w:val="26"/>
               </w:rPr>
-              <w:instrText xml:space="preserve"> PAGEREF _Toc226205054 \h </w:instrText>
+              <w:instrText xml:space="preserve"> PAGEREF _Toc226470179 \h </w:instrText>
             </w:r>
             <w:r>
               <w:rPr>
@@ -3575,7 +3621,7 @@
               <w:szCs w:val="26"/>
             </w:rPr>
           </w:pPr>
-          <w:hyperlink w:anchor="_Toc226205055" w:history="1">
+          <w:hyperlink w:anchor="_Toc226470180" w:history="1">
             <w:r>
               <w:rPr>
                 <w:rStyle w:val="Hyperlink"/>
@@ -3616,7 +3662,7 @@
                 <w:sz w:val="26"/>
                 <w:szCs w:val="26"/>
               </w:rPr>
-              <w:instrText xml:space="preserve"> PAGEREF _Toc226205055 \h </w:instrText>
+              <w:instrText xml:space="preserve"> PAGEREF _Toc226470180 \h </w:instrText>
             </w:r>
             <w:r>
               <w:rPr>
@@ -3673,7 +3719,7 @@
               <w:szCs w:val="26"/>
             </w:rPr>
           </w:pPr>
-          <w:hyperlink w:anchor="_Toc226205056" w:history="1">
+          <w:hyperlink w:anchor="_Toc226470181" w:history="1">
             <w:r>
               <w:rPr>
                 <w:rStyle w:val="Hyperlink"/>
@@ -3714,7 +3760,7 @@
                 <w:sz w:val="26"/>
                 <w:szCs w:val="26"/>
               </w:rPr>
-              <w:instrText xml:space="preserve"> PAGEREF _Toc226205056 \h </w:instrText>
+              <w:instrText xml:space="preserve"> PAGEREF _Toc226470181 \h </w:instrText>
             </w:r>
             <w:r>
               <w:rPr>
@@ -3771,7 +3817,7 @@
               <w:szCs w:val="26"/>
             </w:rPr>
           </w:pPr>
-          <w:hyperlink w:anchor="_Toc226205057" w:history="1">
+          <w:hyperlink w:anchor="_Toc226470182" w:history="1">
             <w:r>
               <w:rPr>
                 <w:rStyle w:val="Hyperlink"/>
@@ -3812,7 +3858,7 @@
                 <w:sz w:val="26"/>
                 <w:szCs w:val="26"/>
               </w:rPr>
-              <w:instrText xml:space="preserve"> PAGEREF _Toc226205057 \h </w:instrText>
+              <w:instrText xml:space="preserve"> PAGEREF _Toc226470182 \h </w:instrText>
             </w:r>
             <w:r>
               <w:rPr>
@@ -3869,7 +3915,7 @@
               <w:szCs w:val="26"/>
             </w:rPr>
           </w:pPr>
-          <w:hyperlink w:anchor="_Toc226205058" w:history="1">
+          <w:hyperlink w:anchor="_Toc226470183" w:history="1">
             <w:r>
               <w:rPr>
                 <w:rStyle w:val="Hyperlink"/>
@@ -3910,7 +3956,7 @@
                 <w:sz w:val="26"/>
                 <w:szCs w:val="26"/>
               </w:rPr>
-              <w:instrText xml:space="preserve"> PAGEREF _Toc226205058 \h </w:instrText>
+              <w:instrText xml:space="preserve"> PAGEREF _Toc226470183 \h </w:instrText>
             </w:r>
             <w:r>
               <w:rPr>
@@ -3967,7 +4013,7 @@
               <w:szCs w:val="26"/>
             </w:rPr>
           </w:pPr>
-          <w:hyperlink w:anchor="_Toc226205059" w:history="1">
+          <w:hyperlink w:anchor="_Toc226470184" w:history="1">
             <w:r>
               <w:rPr>
                 <w:rStyle w:val="Hyperlink"/>
@@ -4008,7 +4054,7 @@
                 <w:sz w:val="26"/>
                 <w:szCs w:val="26"/>
               </w:rPr>
-              <w:instrText xml:space="preserve"> PAGEREF _Toc226205059 \h </w:instrText>
+              <w:instrText xml:space="preserve"> PAGEREF _Toc226470184 \h </w:instrText>
             </w:r>
             <w:r>
               <w:rPr>
@@ -4037,7 +4083,7 @@
                 <w:sz w:val="26"/>
                 <w:szCs w:val="26"/>
               </w:rPr>
-              <w:t>21</w:t>
+              <w:t>20</w:t>
             </w:r>
             <w:r>
               <w:rPr>
@@ -4065,7 +4111,7 @@
               <w:szCs w:val="26"/>
             </w:rPr>
           </w:pPr>
-          <w:hyperlink w:anchor="_Toc226205060" w:history="1">
+          <w:hyperlink w:anchor="_Toc226470185" w:history="1">
             <w:r>
               <w:rPr>
                 <w:rStyle w:val="Hyperlink"/>
@@ -4106,7 +4152,7 @@
                 <w:sz w:val="26"/>
                 <w:szCs w:val="26"/>
               </w:rPr>
-              <w:instrText xml:space="preserve"> PAGEREF _Toc226205060 \h </w:instrText>
+              <w:instrText xml:space="preserve"> PAGEREF _Toc226470185 \h </w:instrText>
             </w:r>
             <w:r>
               <w:rPr>
@@ -4163,7 +4209,7 @@
               <w:szCs w:val="26"/>
             </w:rPr>
           </w:pPr>
-          <w:hyperlink w:anchor="_Toc226205061" w:history="1">
+          <w:hyperlink w:anchor="_Toc226470186" w:history="1">
             <w:r>
               <w:rPr>
                 <w:rStyle w:val="Hyperlink"/>
@@ -4204,7 +4250,7 @@
                 <w:sz w:val="26"/>
                 <w:szCs w:val="26"/>
               </w:rPr>
-              <w:instrText xml:space="preserve"> PAGEREF _Toc226205061 \h </w:instrText>
+              <w:instrText xml:space="preserve"> PAGEREF _Toc226470186 \h </w:instrText>
             </w:r>
             <w:r>
               <w:rPr>
@@ -4233,7 +4279,7 @@
                 <w:sz w:val="26"/>
                 <w:szCs w:val="26"/>
               </w:rPr>
-              <w:t>22</w:t>
+              <w:t>21</w:t>
             </w:r>
             <w:r>
               <w:rPr>
@@ -4261,7 +4307,7 @@
               <w:szCs w:val="26"/>
             </w:rPr>
           </w:pPr>
-          <w:hyperlink w:anchor="_Toc226205062" w:history="1">
+          <w:hyperlink w:anchor="_Toc226470187" w:history="1">
             <w:r>
               <w:rPr>
                 <w:rStyle w:val="Hyperlink"/>
@@ -4302,7 +4348,7 @@
                 <w:sz w:val="26"/>
                 <w:szCs w:val="26"/>
               </w:rPr>
-              <w:instrText xml:space="preserve"> PAGEREF _Toc226205062 \h </w:instrText>
+              <w:instrText xml:space="preserve"> PAGEREF _Toc226470187 \h </w:instrText>
             </w:r>
             <w:r>
               <w:rPr>
@@ -4359,7 +4405,7 @@
               <w:szCs w:val="26"/>
             </w:rPr>
           </w:pPr>
-          <w:hyperlink w:anchor="_Toc226205063" w:history="1">
+          <w:hyperlink w:anchor="_Toc226470188" w:history="1">
             <w:r>
               <w:rPr>
                 <w:rStyle w:val="Hyperlink"/>
@@ -4400,7 +4446,7 @@
                 <w:sz w:val="26"/>
                 <w:szCs w:val="26"/>
               </w:rPr>
-              <w:instrText xml:space="preserve"> PAGEREF _Toc226205063 \h </w:instrText>
+              <w:instrText xml:space="preserve"> PAGEREF _Toc226470188 \h </w:instrText>
             </w:r>
             <w:r>
               <w:rPr>
@@ -4457,7 +4503,7 @@
               <w:szCs w:val="26"/>
             </w:rPr>
           </w:pPr>
-          <w:hyperlink w:anchor="_Toc226205064" w:history="1">
+          <w:hyperlink w:anchor="_Toc226470189" w:history="1">
             <w:r>
               <w:rPr>
                 <w:rStyle w:val="Hyperlink"/>
@@ -4498,7 +4544,7 @@
                 <w:sz w:val="26"/>
                 <w:szCs w:val="26"/>
               </w:rPr>
-              <w:instrText xml:space="preserve"> PAGEREF _Toc226205064 \h </w:instrText>
+              <w:instrText xml:space="preserve"> PAGEREF _Toc226470189 \h </w:instrText>
             </w:r>
             <w:r>
               <w:rPr>
@@ -4555,7 +4601,7 @@
               <w:szCs w:val="26"/>
             </w:rPr>
           </w:pPr>
-          <w:hyperlink w:anchor="_Toc226205065" w:history="1">
+          <w:hyperlink w:anchor="_Toc226470190" w:history="1">
             <w:r>
               <w:rPr>
                 <w:rStyle w:val="Hyperlink"/>
@@ -4596,7 +4642,7 @@
                 <w:sz w:val="26"/>
                 <w:szCs w:val="26"/>
               </w:rPr>
-              <w:instrText xml:space="preserve"> PAGEREF _Toc226205065 \h </w:instrText>
+              <w:instrText xml:space="preserve"> PAGEREF _Toc226470190 \h </w:instrText>
             </w:r>
             <w:r>
               <w:rPr>
@@ -4653,7 +4699,7 @@
               <w:szCs w:val="26"/>
             </w:rPr>
           </w:pPr>
-          <w:hyperlink w:anchor="_Toc226205066" w:history="1">
+          <w:hyperlink w:anchor="_Toc226470191" w:history="1">
             <w:r>
               <w:rPr>
                 <w:rStyle w:val="Hyperlink"/>
@@ -4694,7 +4740,7 @@
                 <w:sz w:val="26"/>
                 <w:szCs w:val="26"/>
               </w:rPr>
-              <w:instrText xml:space="preserve"> PAGEREF _Toc226205066 \h </w:instrText>
+              <w:instrText xml:space="preserve"> PAGEREF _Toc226470191 \h </w:instrText>
             </w:r>
             <w:r>
               <w:rPr>
@@ -4751,7 +4797,7 @@
               <w:szCs w:val="26"/>
             </w:rPr>
           </w:pPr>
-          <w:hyperlink w:anchor="_Toc226205067" w:history="1">
+          <w:hyperlink w:anchor="_Toc226470192" w:history="1">
             <w:r>
               <w:rPr>
                 <w:rStyle w:val="Hyperlink"/>
@@ -4792,7 +4838,7 @@
                 <w:sz w:val="26"/>
                 <w:szCs w:val="26"/>
               </w:rPr>
-              <w:instrText xml:space="preserve"> PAGEREF _Toc226205067 \h </w:instrText>
+              <w:instrText xml:space="preserve"> PAGEREF _Toc226470192 \h </w:instrText>
             </w:r>
             <w:r>
               <w:rPr>
@@ -4849,7 +4895,7 @@
               <w:szCs w:val="26"/>
             </w:rPr>
           </w:pPr>
-          <w:hyperlink w:anchor="_Toc226205068" w:history="1">
+          <w:hyperlink w:anchor="_Toc226470193" w:history="1">
             <w:r>
               <w:rPr>
                 <w:rStyle w:val="Hyperlink"/>
@@ -4890,7 +4936,7 @@
                 <w:sz w:val="26"/>
                 <w:szCs w:val="26"/>
               </w:rPr>
-              <w:instrText xml:space="preserve"> PAGEREF _Toc226205068 \h </w:instrText>
+              <w:instrText xml:space="preserve"> PAGEREF _Toc226470193 \h </w:instrText>
             </w:r>
             <w:r>
               <w:rPr>
@@ -4947,7 +4993,7 @@
               <w:szCs w:val="26"/>
             </w:rPr>
           </w:pPr>
-          <w:hyperlink w:anchor="_Toc226205069" w:history="1">
+          <w:hyperlink w:anchor="_Toc226470194" w:history="1">
             <w:r>
               <w:rPr>
                 <w:rStyle w:val="Hyperlink"/>
@@ -4988,7 +5034,7 @@
                 <w:sz w:val="26"/>
                 <w:szCs w:val="26"/>
               </w:rPr>
-              <w:instrText xml:space="preserve"> PAGEREF _Toc226205069 \h </w:instrText>
+              <w:instrText xml:space="preserve"> PAGEREF _Toc226470194 \h </w:instrText>
             </w:r>
             <w:r>
               <w:rPr>
@@ -5045,7 +5091,7 @@
               <w:szCs w:val="26"/>
             </w:rPr>
           </w:pPr>
-          <w:hyperlink w:anchor="_Toc226205070" w:history="1">
+          <w:hyperlink w:anchor="_Toc226470195" w:history="1">
             <w:r>
               <w:rPr>
                 <w:rStyle w:val="Hyperlink"/>
@@ -5086,7 +5132,7 @@
                 <w:sz w:val="26"/>
                 <w:szCs w:val="26"/>
               </w:rPr>
-              <w:instrText xml:space="preserve"> PAGEREF _Toc226205070 \h </w:instrText>
+              <w:instrText xml:space="preserve"> PAGEREF _Toc226470195 \h </w:instrText>
             </w:r>
             <w:r>
               <w:rPr>
@@ -5143,7 +5189,7 @@
               <w:szCs w:val="26"/>
             </w:rPr>
           </w:pPr>
-          <w:hyperlink w:anchor="_Toc226205071" w:history="1">
+          <w:hyperlink w:anchor="_Toc226470196" w:history="1">
             <w:r>
               <w:rPr>
                 <w:rStyle w:val="Hyperlink"/>
@@ -5184,7 +5230,7 @@
                 <w:sz w:val="26"/>
                 <w:szCs w:val="26"/>
               </w:rPr>
-              <w:instrText xml:space="preserve"> PAGEREF _Toc226205071 \h </w:instrText>
+              <w:instrText xml:space="preserve"> PAGEREF _Toc226470196 \h </w:instrText>
             </w:r>
             <w:r>
               <w:rPr>
@@ -5241,7 +5287,7 @@
               <w:szCs w:val="26"/>
             </w:rPr>
           </w:pPr>
-          <w:hyperlink w:anchor="_Toc226205072" w:history="1">
+          <w:hyperlink w:anchor="_Toc226470197" w:history="1">
             <w:r>
               <w:rPr>
                 <w:rStyle w:val="Hyperlink"/>
@@ -5282,7 +5328,7 @@
                 <w:sz w:val="26"/>
                 <w:szCs w:val="26"/>
               </w:rPr>
-              <w:instrText xml:space="preserve"> PAGEREF _Toc226205072 \h </w:instrText>
+              <w:instrText xml:space="preserve"> PAGEREF _Toc226470197 \h </w:instrText>
             </w:r>
             <w:r>
               <w:rPr>
@@ -5339,7 +5385,7 @@
               <w:szCs w:val="26"/>
             </w:rPr>
           </w:pPr>
-          <w:hyperlink w:anchor="_Toc226205073" w:history="1">
+          <w:hyperlink w:anchor="_Toc226470198" w:history="1">
             <w:r>
               <w:rPr>
                 <w:rStyle w:val="Hyperlink"/>
@@ -5380,7 +5426,7 @@
                 <w:sz w:val="26"/>
                 <w:szCs w:val="26"/>
               </w:rPr>
-              <w:instrText xml:space="preserve"> PAGEREF _Toc226205073 \h </w:instrText>
+              <w:instrText xml:space="preserve"> PAGEREF _Toc226470198 \h </w:instrText>
             </w:r>
             <w:r>
               <w:rPr>
@@ -5437,7 +5483,7 @@
               <w:szCs w:val="26"/>
             </w:rPr>
           </w:pPr>
-          <w:hyperlink w:anchor="_Toc226205074" w:history="1">
+          <w:hyperlink w:anchor="_Toc226470199" w:history="1">
             <w:r>
               <w:rPr>
                 <w:rStyle w:val="Hyperlink"/>
@@ -5478,7 +5524,7 @@
                 <w:sz w:val="26"/>
                 <w:szCs w:val="26"/>
               </w:rPr>
-              <w:instrText xml:space="preserve"> PAGEREF _Toc226205074 \h </w:instrText>
+              <w:instrText xml:space="preserve"> PAGEREF _Toc226470199 \h </w:instrText>
             </w:r>
             <w:r>
               <w:rPr>
@@ -5507,7 +5553,7 @@
                 <w:sz w:val="26"/>
                 <w:szCs w:val="26"/>
               </w:rPr>
-              <w:t>28</w:t>
+              <w:t>29</w:t>
             </w:r>
             <w:r>
               <w:rPr>
@@ -5535,7 +5581,7 @@
               <w:szCs w:val="26"/>
             </w:rPr>
           </w:pPr>
-          <w:hyperlink w:anchor="_Toc226205075" w:history="1">
+          <w:hyperlink w:anchor="_Toc226470200" w:history="1">
             <w:r>
               <w:rPr>
                 <w:rStyle w:val="Hyperlink"/>
@@ -5576,7 +5622,7 @@
                 <w:sz w:val="26"/>
                 <w:szCs w:val="26"/>
               </w:rPr>
-              <w:instrText xml:space="preserve"> PAGEREF _Toc226205075 \h </w:instrText>
+              <w:instrText xml:space="preserve"> PAGEREF _Toc226470200 \h </w:instrText>
             </w:r>
             <w:r>
               <w:rPr>
@@ -5633,7 +5679,7 @@
               <w:szCs w:val="26"/>
             </w:rPr>
           </w:pPr>
-          <w:hyperlink w:anchor="_Toc226205076" w:history="1">
+          <w:hyperlink w:anchor="_Toc226470201" w:history="1">
             <w:r>
               <w:rPr>
                 <w:rStyle w:val="Hyperlink"/>
@@ -5674,7 +5720,7 @@
                 <w:sz w:val="26"/>
                 <w:szCs w:val="26"/>
               </w:rPr>
-              <w:instrText xml:space="preserve"> PAGEREF _Toc226205076 \h </w:instrText>
+              <w:instrText xml:space="preserve"> PAGEREF _Toc226470201 \h </w:instrText>
             </w:r>
             <w:r>
               <w:rPr>
@@ -5703,7 +5749,7 @@
                 <w:sz w:val="26"/>
                 <w:szCs w:val="26"/>
               </w:rPr>
-              <w:t>29</w:t>
+              <w:t>30</w:t>
             </w:r>
             <w:r>
               <w:rPr>
@@ -5731,7 +5777,7 @@
               <w:szCs w:val="26"/>
             </w:rPr>
           </w:pPr>
-          <w:hyperlink w:anchor="_Toc226205077" w:history="1">
+          <w:hyperlink w:anchor="_Toc226470202" w:history="1">
             <w:r>
               <w:rPr>
                 <w:rStyle w:val="Hyperlink"/>
@@ -5772,7 +5818,7 @@
                 <w:sz w:val="26"/>
                 <w:szCs w:val="26"/>
               </w:rPr>
-              <w:instrText xml:space="preserve"> PAGEREF _Toc226205077 \h </w:instrText>
+              <w:instrText xml:space="preserve"> PAGEREF _Toc226470202 \h </w:instrText>
             </w:r>
             <w:r>
               <w:rPr>
@@ -5802,6 +5848,104 @@
                 <w:szCs w:val="26"/>
               </w:rPr>
               <w:t>30</w:t>
+            </w:r>
+            <w:r>
+              <w:rPr>
+                <w:rFonts w:ascii="Times New Roman" w:hAnsi="Times New Roman" w:cs="Times New Roman"/>
+                <w:noProof/>
+                <w:webHidden/>
+                <w:sz w:val="26"/>
+                <w:szCs w:val="26"/>
+              </w:rPr>
+              <w:fldChar w:fldCharType="end"/>
+            </w:r>
+          </w:hyperlink>
+        </w:p>
+        <w:p>
+          <w:pPr>
+            <w:pStyle w:val="TOC1"/>
+            <w:tabs>
+              <w:tab w:val="right" w:leader="dot" w:pos="9629"/>
+            </w:tabs>
+            <w:spacing w:after="0" w:line="360" w:lineRule="auto"/>
+            <w:rPr>
+              <w:rFonts w:ascii="Times New Roman" w:eastAsiaTheme="minorEastAsia" w:hAnsi="Times New Roman" w:cs="Times New Roman"/>
+              <w:noProof/>
+              <w:sz w:val="26"/>
+              <w:szCs w:val="26"/>
+            </w:rPr>
+          </w:pPr>
+          <w:hyperlink w:anchor="_Toc226470203" w:history="1">
+            <w:r>
+              <w:rPr>
+                <w:rStyle w:val="Hyperlink"/>
+                <w:rFonts w:ascii="Times New Roman" w:hAnsi="Times New Roman" w:cs="Times New Roman"/>
+                <w:b/>
+                <w:bCs/>
+                <w:noProof/>
+                <w:sz w:val="26"/>
+                <w:szCs w:val="26"/>
+              </w:rPr>
+              <w:t>BÀI 53. XÂU NHỊ PHÂN CÓ NHIỀU HƠN K BIT 1</w:t>
+            </w:r>
+            <w:r>
+              <w:rPr>
+                <w:rFonts w:ascii="Times New Roman" w:hAnsi="Times New Roman" w:cs="Times New Roman"/>
+                <w:noProof/>
+                <w:webHidden/>
+                <w:sz w:val="26"/>
+                <w:szCs w:val="26"/>
+              </w:rPr>
+              <w:tab/>
+            </w:r>
+            <w:r>
+              <w:rPr>
+                <w:rFonts w:ascii="Times New Roman" w:hAnsi="Times New Roman" w:cs="Times New Roman"/>
+                <w:noProof/>
+                <w:webHidden/>
+                <w:sz w:val="26"/>
+                <w:szCs w:val="26"/>
+              </w:rPr>
+              <w:fldChar w:fldCharType="begin"/>
+            </w:r>
+            <w:r>
+              <w:rPr>
+                <w:rFonts w:ascii="Times New Roman" w:hAnsi="Times New Roman" w:cs="Times New Roman"/>
+                <w:noProof/>
+                <w:webHidden/>
+                <w:sz w:val="26"/>
+                <w:szCs w:val="26"/>
+              </w:rPr>
+              <w:instrText xml:space="preserve"> PAGEREF _Toc226470203 \h </w:instrText>
+            </w:r>
+            <w:r>
+              <w:rPr>
+                <w:rFonts w:ascii="Times New Roman" w:hAnsi="Times New Roman" w:cs="Times New Roman"/>
+                <w:noProof/>
+                <w:webHidden/>
+                <w:sz w:val="26"/>
+                <w:szCs w:val="26"/>
+              </w:rPr>
+            </w:r>
+            <w:r>
+              <w:rPr>
+                <w:rFonts w:ascii="Times New Roman" w:hAnsi="Times New Roman" w:cs="Times New Roman"/>
+                <w:noProof/>
+                <w:webHidden/>
+                <w:sz w:val="26"/>
+                <w:szCs w:val="26"/>
+              </w:rPr>
+              <w:fldChar w:fldCharType="separate"/>
+            </w:r>
+            <w:r>
+              <w:rPr>
+                <w:rFonts w:ascii="Times New Roman" w:hAnsi="Times New Roman" w:cs="Times New Roman"/>
+                <w:noProof/>
+                <w:webHidden/>
+                <w:sz w:val="26"/>
+                <w:szCs w:val="26"/>
+              </w:rPr>
+              <w:t>31</w:t>
             </w:r>
             <w:r>
               <w:rPr>
@@ -5912,17 +6056,7 @@
     </w:p>
     <w:p>
       <w:pPr>
-        <w:rPr>
-          <w:rFonts w:ascii="Times New Roman" w:hAnsi="Times New Roman" w:cs="Times New Roman"/>
-          <w:b/>
-          <w:bCs/>
-          <w:sz w:val="26"/>
-          <w:szCs w:val="26"/>
-        </w:rPr>
-      </w:pPr>
-    </w:p>
-    <w:p>
-      <w:pPr>
+        <w:spacing w:after="0"/>
         <w:rPr>
           <w:rFonts w:ascii="Times New Roman" w:hAnsi="Times New Roman" w:cs="Times New Roman"/>
           <w:b/>
@@ -5945,7 +6079,7 @@
           <w:szCs w:val="26"/>
         </w:rPr>
       </w:pPr>
-      <w:bookmarkStart w:id="1" w:name="_Toc226205026"/>
+      <w:bookmarkStart w:id="1" w:name="_Toc226470151"/>
       <w:r>
         <w:rPr>
           <w:rFonts w:ascii="Times New Roman" w:hAnsi="Times New Roman" w:cs="Times New Roman"/>
@@ -6431,7 +6565,7 @@
           <w:szCs w:val="26"/>
         </w:rPr>
       </w:pPr>
-      <w:bookmarkStart w:id="2" w:name="_Toc226205027"/>
+      <w:bookmarkStart w:id="2" w:name="_Toc226470152"/>
       <w:r>
         <w:rPr>
           <w:rFonts w:ascii="Times New Roman" w:hAnsi="Times New Roman" w:cs="Times New Roman"/>
@@ -6875,7 +7009,7 @@
           <w:szCs w:val="26"/>
         </w:rPr>
       </w:pPr>
-      <w:bookmarkStart w:id="3" w:name="_Toc226205028"/>
+      <w:bookmarkStart w:id="3" w:name="_Toc226470153"/>
       <w:r>
         <w:rPr>
           <w:rFonts w:ascii="Times New Roman" w:hAnsi="Times New Roman" w:cs="Times New Roman"/>
@@ -8547,7 +8681,7 @@
           <w:szCs w:val="26"/>
         </w:rPr>
       </w:pPr>
-      <w:bookmarkStart w:id="4" w:name="_Toc226205029"/>
+      <w:bookmarkStart w:id="4" w:name="_Toc226470154"/>
       <w:r>
         <w:rPr>
           <w:rFonts w:ascii="Times New Roman" w:hAnsi="Times New Roman" w:cs="Times New Roman"/>
@@ -8991,7 +9125,7 @@
           <w:szCs w:val="26"/>
         </w:rPr>
       </w:pPr>
-      <w:bookmarkStart w:id="5" w:name="_Toc226205030"/>
+      <w:bookmarkStart w:id="5" w:name="_Toc226470155"/>
       <w:r>
         <w:rPr>
           <w:rFonts w:ascii="Times New Roman" w:hAnsi="Times New Roman" w:cs="Times New Roman"/>
@@ -10655,7 +10789,7 @@
           <w:szCs w:val="26"/>
         </w:rPr>
       </w:pPr>
-      <w:bookmarkStart w:id="6" w:name="_Toc226205031"/>
+      <w:bookmarkStart w:id="6" w:name="_Toc226470156"/>
       <w:r>
         <w:rPr>
           <w:rFonts w:ascii="Times New Roman" w:hAnsi="Times New Roman" w:cs="Times New Roman"/>
@@ -11270,7 +11404,7 @@
           <w:szCs w:val="26"/>
         </w:rPr>
       </w:pPr>
-      <w:bookmarkStart w:id="7" w:name="_Toc226205032"/>
+      <w:bookmarkStart w:id="7" w:name="_Toc226470157"/>
       <w:r>
         <w:rPr>
           <w:rFonts w:ascii="Times New Roman" w:hAnsi="Times New Roman" w:cs="Times New Roman"/>
@@ -11706,7 +11840,7 @@
           <w:szCs w:val="26"/>
         </w:rPr>
       </w:pPr>
-      <w:bookmarkStart w:id="8" w:name="_Toc226205033"/>
+      <w:bookmarkStart w:id="8" w:name="_Toc226470158"/>
       <w:r>
         <w:rPr>
           <w:rFonts w:ascii="Times New Roman" w:hAnsi="Times New Roman" w:cs="Times New Roman"/>
@@ -12180,7 +12314,7 @@
           <w:szCs w:val="26"/>
         </w:rPr>
       </w:pPr>
-      <w:bookmarkStart w:id="9" w:name="_Toc226205034"/>
+      <w:bookmarkStart w:id="9" w:name="_Toc226470159"/>
       <w:r>
         <w:rPr>
           <w:rFonts w:ascii="Times New Roman" w:hAnsi="Times New Roman" w:cs="Times New Roman"/>
@@ -12613,7 +12747,7 @@
           <w:szCs w:val="26"/>
         </w:rPr>
       </w:pPr>
-      <w:bookmarkStart w:id="10" w:name="_Toc226205035"/>
+      <w:bookmarkStart w:id="10" w:name="_Toc226470160"/>
       <w:r>
         <w:rPr>
           <w:rFonts w:ascii="Times New Roman" w:hAnsi="Times New Roman" w:cs="Times New Roman"/>
@@ -13064,7 +13198,7 @@
           <w:szCs w:val="26"/>
         </w:rPr>
       </w:pPr>
-      <w:bookmarkStart w:id="11" w:name="_Toc226205036"/>
+      <w:bookmarkStart w:id="11" w:name="_Toc226470161"/>
       <w:r>
         <w:rPr>
           <w:rFonts w:ascii="Times New Roman" w:hAnsi="Times New Roman" w:cs="Times New Roman"/>
@@ -13637,7 +13771,7 @@
           <w:szCs w:val="26"/>
         </w:rPr>
       </w:pPr>
-      <w:bookmarkStart w:id="13" w:name="_Toc226205037"/>
+      <w:bookmarkStart w:id="13" w:name="_Toc226470162"/>
       <w:r>
         <w:rPr>
           <w:rFonts w:ascii="Times New Roman" w:hAnsi="Times New Roman" w:cs="Times New Roman"/>
@@ -14087,7 +14221,7 @@
           <w:szCs w:val="26"/>
         </w:rPr>
       </w:pPr>
-      <w:bookmarkStart w:id="14" w:name="_Toc226205038"/>
+      <w:bookmarkStart w:id="14" w:name="_Toc226470163"/>
       <w:r>
         <w:rPr>
           <w:rFonts w:ascii="Times New Roman" w:hAnsi="Times New Roman" w:cs="Times New Roman"/>
@@ -14504,7 +14638,7 @@
           <w:szCs w:val="26"/>
         </w:rPr>
       </w:pPr>
-      <w:bookmarkStart w:id="15" w:name="_Toc226205039"/>
+      <w:bookmarkStart w:id="15" w:name="_Toc226470164"/>
       <w:r>
         <w:rPr>
           <w:rFonts w:ascii="Times New Roman" w:hAnsi="Times New Roman" w:cs="Times New Roman"/>
@@ -15040,7 +15174,7 @@
           <w:szCs w:val="26"/>
         </w:rPr>
       </w:pPr>
-      <w:bookmarkStart w:id="16" w:name="_Toc226205040"/>
+      <w:bookmarkStart w:id="16" w:name="_Toc226470165"/>
       <w:r>
         <w:rPr>
           <w:rFonts w:ascii="Times New Roman" w:hAnsi="Times New Roman" w:cs="Times New Roman"/>
@@ -15590,7 +15724,7 @@
           <w:szCs w:val="26"/>
         </w:rPr>
       </w:pPr>
-      <w:bookmarkStart w:id="17" w:name="_Toc226205041"/>
+      <w:bookmarkStart w:id="17" w:name="_Toc226470166"/>
       <w:r>
         <w:rPr>
           <w:rFonts w:ascii="Times New Roman" w:hAnsi="Times New Roman" w:cs="Times New Roman"/>
@@ -16030,16 +16164,6 @@
     </w:p>
     <w:p>
       <w:pPr>
-        <w:spacing w:after="0" w:line="276" w:lineRule="auto"/>
-        <w:rPr>
-          <w:rFonts w:ascii="Times New Roman" w:hAnsi="Times New Roman" w:cs="Times New Roman"/>
-          <w:sz w:val="26"/>
-          <w:szCs w:val="26"/>
-        </w:rPr>
-      </w:pPr>
-    </w:p>
-    <w:p>
-      <w:pPr>
         <w:pStyle w:val="Heading1"/>
         <w:spacing w:before="0" w:after="0" w:line="276" w:lineRule="auto"/>
         <w:rPr>
@@ -16051,7 +16175,7 @@
           <w:szCs w:val="26"/>
         </w:rPr>
       </w:pPr>
-      <w:bookmarkStart w:id="18" w:name="_Toc226205042"/>
+      <w:bookmarkStart w:id="18" w:name="_Toc226470167"/>
       <w:r>
         <w:rPr>
           <w:rFonts w:ascii="Times New Roman" w:hAnsi="Times New Roman" w:cs="Times New Roman"/>
@@ -16707,7 +16831,6 @@
                 <w:sz w:val="26"/>
                 <w:szCs w:val="26"/>
               </w:rPr>
-              <w:lastRenderedPageBreak/>
               <w:t>7523</w:t>
             </w:r>
           </w:p>
@@ -16727,7 +16850,7 @@
           <w:szCs w:val="26"/>
         </w:rPr>
       </w:pPr>
-      <w:bookmarkStart w:id="19" w:name="_Toc226205043"/>
+      <w:bookmarkStart w:id="19" w:name="_Toc226470168"/>
       <w:r>
         <w:rPr>
           <w:rFonts w:ascii="Times New Roman" w:hAnsi="Times New Roman" w:cs="Times New Roman"/>
@@ -17082,6 +17205,34 @@
         <w:spacing w:after="0" w:line="276" w:lineRule="auto"/>
         <w:rPr>
           <w:rFonts w:ascii="Times New Roman" w:hAnsi="Times New Roman" w:cs="Times New Roman"/>
+          <w:sz w:val="26"/>
+          <w:szCs w:val="26"/>
+        </w:rPr>
+      </w:pPr>
+      <w:r>
+        <w:rPr>
+          <w:rFonts w:ascii="Times New Roman" w:hAnsi="Times New Roman" w:cs="Times New Roman"/>
+          <w:b/>
+          <w:bCs/>
+          <w:sz w:val="26"/>
+          <w:szCs w:val="26"/>
+        </w:rPr>
+        <w:t xml:space="preserve">Phân dạng: </w:t>
+      </w:r>
+      <w:r>
+        <w:rPr>
+          <w:rFonts w:ascii="Times New Roman" w:hAnsi="Times New Roman" w:cs="Times New Roman"/>
+          <w:sz w:val="26"/>
+          <w:szCs w:val="26"/>
+        </w:rPr>
+        <w:t>Chỉnh hợp lặp, sinh theo BFS.</w:t>
+      </w:r>
+    </w:p>
+    <w:p>
+      <w:pPr>
+        <w:spacing w:after="0" w:line="276" w:lineRule="auto"/>
+        <w:rPr>
+          <w:rFonts w:ascii="Times New Roman" w:hAnsi="Times New Roman" w:cs="Times New Roman"/>
           <w:b/>
           <w:bCs/>
           <w:sz w:val="26"/>
@@ -17102,7 +17253,7 @@
           <w:szCs w:val="26"/>
         </w:rPr>
       </w:pPr>
-      <w:bookmarkStart w:id="20" w:name="_Toc226205044"/>
+      <w:bookmarkStart w:id="20" w:name="_Toc226470169"/>
       <w:r>
         <w:rPr>
           <w:rFonts w:ascii="Times New Roman" w:hAnsi="Times New Roman" w:cs="Times New Roman"/>
@@ -17230,6 +17381,22 @@
         </w:rPr>
         <w:t>Input</w:t>
       </w:r>
+      <w:r>
+        <w:rPr>
+          <w:rFonts w:ascii="Times New Roman" w:hAnsi="Times New Roman" w:cs="Times New Roman"/>
+          <w:sz w:val="26"/>
+          <w:szCs w:val="26"/>
+        </w:rPr>
+        <w:t xml:space="preserve">. </w:t>
+      </w:r>
+      <w:r>
+        <w:rPr>
+          <w:rFonts w:ascii="Times New Roman" w:hAnsi="Times New Roman" w:cs="Times New Roman"/>
+          <w:sz w:val="26"/>
+          <w:szCs w:val="26"/>
+        </w:rPr>
+        <w:t>Chỉ có một dòng ghi số N, không quá 12.</w:t>
+      </w:r>
     </w:p>
     <w:p>
       <w:pPr>
@@ -17243,14 +17410,21 @@
       <w:r>
         <w:rPr>
           <w:rFonts w:ascii="Times New Roman" w:hAnsi="Times New Roman" w:cs="Times New Roman"/>
-          <w:sz w:val="26"/>
-          <w:szCs w:val="26"/>
-        </w:rPr>
-        <w:t>Chỉ có một dòng ghi số N, không quá 12.</w:t>
-      </w:r>
-    </w:p>
-    <w:p>
-      <w:pPr>
+          <w:b/>
+          <w:bCs/>
+          <w:sz w:val="26"/>
+          <w:szCs w:val="26"/>
+        </w:rPr>
+        <w:t>Output</w:t>
+      </w:r>
+    </w:p>
+    <w:p>
+      <w:pPr>
+        <w:pStyle w:val="ListParagraph"/>
+        <w:numPr>
+          <w:ilvl w:val="0"/>
+          <w:numId w:val="2"/>
+        </w:numPr>
         <w:spacing w:after="0" w:line="276" w:lineRule="auto"/>
         <w:rPr>
           <w:rFonts w:ascii="Times New Roman" w:hAnsi="Times New Roman" w:cs="Times New Roman"/>
@@ -17261,16 +17435,19 @@
       <w:r>
         <w:rPr>
           <w:rFonts w:ascii="Times New Roman" w:hAnsi="Times New Roman" w:cs="Times New Roman"/>
-          <w:b/>
-          <w:bCs/>
-          <w:sz w:val="26"/>
-          <w:szCs w:val="26"/>
-        </w:rPr>
-        <w:t>Output</w:t>
-      </w:r>
-    </w:p>
-    <w:p>
-      <w:pPr>
+          <w:sz w:val="26"/>
+          <w:szCs w:val="26"/>
+        </w:rPr>
+        <w:t>Ghi ra lần lượt các xâu thỏa mãn theo thứ tự độ dài từ ngắn nhất đến dài nhất.</w:t>
+      </w:r>
+    </w:p>
+    <w:p>
+      <w:pPr>
+        <w:pStyle w:val="ListParagraph"/>
+        <w:numPr>
+          <w:ilvl w:val="0"/>
+          <w:numId w:val="2"/>
+        </w:numPr>
         <w:spacing w:after="0" w:line="276" w:lineRule="auto"/>
         <w:rPr>
           <w:rFonts w:ascii="Times New Roman" w:hAnsi="Times New Roman" w:cs="Times New Roman"/>
@@ -17284,11 +17461,16 @@
           <w:sz w:val="26"/>
           <w:szCs w:val="26"/>
         </w:rPr>
-        <w:t>Ghi ra lần lượt các xâu thỏa mãn theo thứ tự độ dài từ ngắn nhất đến dài nhất.</w:t>
-      </w:r>
-    </w:p>
-    <w:p>
-      <w:pPr>
+        <w:t>Nếu có cùng độ dài thì ghi theo thứ tự từ điển.</w:t>
+      </w:r>
+    </w:p>
+    <w:p>
+      <w:pPr>
+        <w:pStyle w:val="ListParagraph"/>
+        <w:numPr>
+          <w:ilvl w:val="0"/>
+          <w:numId w:val="2"/>
+        </w:numPr>
         <w:spacing w:after="0" w:line="276" w:lineRule="auto"/>
         <w:rPr>
           <w:rFonts w:ascii="Times New Roman" w:hAnsi="Times New Roman" w:cs="Times New Roman"/>
@@ -17302,7 +17484,7 @@
           <w:sz w:val="26"/>
           <w:szCs w:val="26"/>
         </w:rPr>
-        <w:t>Nếu có cùng độ dài thì ghi theo thứ tự từ điển.</w:t>
+        <w:t>Mỗi xâu ghi trên một dòng.</w:t>
       </w:r>
     </w:p>
     <w:p>
@@ -17317,11 +17499,55 @@
       <w:r>
         <w:rPr>
           <w:rFonts w:ascii="Times New Roman" w:hAnsi="Times New Roman" w:cs="Times New Roman"/>
-          <w:sz w:val="26"/>
-          <w:szCs w:val="26"/>
-        </w:rPr>
-        <w:t>Mỗi xâu ghi trên một dòng.</w:t>
-      </w:r>
+          <w:b/>
+          <w:bCs/>
+          <w:sz w:val="26"/>
+          <w:szCs w:val="26"/>
+        </w:rPr>
+        <w:t xml:space="preserve">Phân dạng: </w:t>
+      </w:r>
+      <w:r>
+        <w:rPr>
+          <w:rFonts w:ascii="Times New Roman" w:hAnsi="Times New Roman" w:cs="Times New Roman"/>
+          <w:sz w:val="26"/>
+          <w:szCs w:val="26"/>
+        </w:rPr>
+        <w:t>Chỉnh hợp lặp, sinh theo BFS.</w:t>
+      </w:r>
+    </w:p>
+    <w:p>
+      <w:pPr>
+        <w:spacing w:after="0" w:line="276" w:lineRule="auto"/>
+        <w:rPr>
+          <w:rFonts w:ascii="Times New Roman" w:hAnsi="Times New Roman" w:cs="Times New Roman"/>
+          <w:sz w:val="26"/>
+          <w:szCs w:val="26"/>
+        </w:rPr>
+      </w:pPr>
+    </w:p>
+    <w:p>
+      <w:pPr>
+        <w:spacing w:after="0" w:line="276" w:lineRule="auto"/>
+        <w:rPr>
+          <w:rFonts w:ascii="Times New Roman" w:hAnsi="Times New Roman" w:cs="Times New Roman"/>
+          <w:b/>
+          <w:bCs/>
+          <w:sz w:val="26"/>
+          <w:szCs w:val="26"/>
+        </w:rPr>
+      </w:pPr>
+    </w:p>
+    <w:p>
+      <w:pPr>
+        <w:spacing w:after="0" w:line="276" w:lineRule="auto"/>
+        <w:rPr>
+          <w:rFonts w:ascii="Times New Roman" w:hAnsi="Times New Roman" w:cs="Times New Roman"/>
+          <w:b/>
+          <w:bCs/>
+          <w:sz w:val="26"/>
+          <w:szCs w:val="26"/>
+        </w:rPr>
+      </w:pPr>
     </w:p>
     <w:p>
       <w:pPr>
@@ -17993,7 +18219,7 @@
           <w:szCs w:val="26"/>
         </w:rPr>
       </w:pPr>
-      <w:bookmarkStart w:id="21" w:name="_Toc226205045"/>
+      <w:bookmarkStart w:id="21" w:name="_Toc226470170"/>
       <w:r>
         <w:rPr>
           <w:rFonts w:ascii="Times New Roman" w:hAnsi="Times New Roman" w:cs="Times New Roman"/>
@@ -18218,25 +18444,34 @@
         </w:rPr>
         <w:t>Ghi ra tất cả các tổ hợp tên có thể được lựa chọn theo thứ tự từ điển.</w:t>
       </w:r>
+      <w:r>
+        <w:rPr>
+          <w:rFonts w:ascii="Times New Roman" w:hAnsi="Times New Roman" w:cs="Times New Roman"/>
+          <w:sz w:val="26"/>
+          <w:szCs w:val="26"/>
+        </w:rPr>
+        <w:t xml:space="preserve"> </w:t>
+      </w:r>
+      <w:r>
+        <w:rPr>
+          <w:rFonts w:ascii="Times New Roman" w:hAnsi="Times New Roman" w:cs="Times New Roman"/>
+          <w:sz w:val="26"/>
+          <w:szCs w:val="26"/>
+        </w:rPr>
+        <w:t>Tức là các tên trong mỗi tổ hợp liệt kê theo thứ tự từ điển và các tổ hợp cũng được liệt kê theo thứ tự từ điển.</w:t>
+      </w:r>
     </w:p>
     <w:p>
       <w:pPr>
         <w:spacing w:after="0" w:line="276" w:lineRule="auto"/>
-        <w:jc w:val="both"/>
-        <w:rPr>
-          <w:rFonts w:ascii="Times New Roman" w:hAnsi="Times New Roman" w:cs="Times New Roman"/>
-          <w:sz w:val="26"/>
-          <w:szCs w:val="26"/>
-        </w:rPr>
-      </w:pPr>
-      <w:r>
-        <w:rPr>
-          <w:rFonts w:ascii="Times New Roman" w:hAnsi="Times New Roman" w:cs="Times New Roman"/>
-          <w:sz w:val="26"/>
-          <w:szCs w:val="26"/>
-        </w:rPr>
-        <w:t>Tức là các tên trong mỗi tổ hợp liệt kê theo thứ tự từ điển và các tổ hợp cũng được liệt kê theo thứ tự từ điển.</w:t>
-      </w:r>
+        <w:rPr>
+          <w:rFonts w:ascii="Times New Roman" w:hAnsi="Times New Roman" w:cs="Times New Roman"/>
+          <w:b/>
+          <w:bCs/>
+          <w:sz w:val="26"/>
+          <w:szCs w:val="26"/>
+        </w:rPr>
+      </w:pPr>
     </w:p>
     <w:p>
       <w:pPr>
@@ -18600,7 +18835,7 @@
           <w:szCs w:val="26"/>
         </w:rPr>
       </w:pPr>
-      <w:bookmarkStart w:id="22" w:name="_Toc226205046"/>
+      <w:bookmarkStart w:id="22" w:name="_Toc226470171"/>
       <w:r>
         <w:rPr>
           <w:rFonts w:ascii="Times New Roman" w:hAnsi="Times New Roman" w:cs="Times New Roman"/>
@@ -19058,7 +19293,7 @@
           <w:szCs w:val="26"/>
         </w:rPr>
       </w:pPr>
-      <w:bookmarkStart w:id="23" w:name="_Toc226205047"/>
+      <w:bookmarkStart w:id="23" w:name="_Toc226470172"/>
       <w:r>
         <w:rPr>
           <w:rFonts w:ascii="Times New Roman" w:hAnsi="Times New Roman" w:cs="Times New Roman"/>
@@ -19147,6 +19382,11 @@
     </w:p>
     <w:p>
       <w:pPr>
+        <w:pStyle w:val="ListParagraph"/>
+        <w:numPr>
+          <w:ilvl w:val="0"/>
+          <w:numId w:val="2"/>
+        </w:numPr>
         <w:spacing w:after="0"/>
         <w:jc w:val="both"/>
         <w:rPr>
@@ -19166,6 +19406,11 @@
     </w:p>
     <w:p>
       <w:pPr>
+        <w:pStyle w:val="ListParagraph"/>
+        <w:numPr>
+          <w:ilvl w:val="0"/>
+          <w:numId w:val="2"/>
+        </w:numPr>
         <w:spacing w:after="0"/>
         <w:jc w:val="both"/>
         <w:rPr>
@@ -19185,6 +19430,11 @@
     </w:p>
     <w:p>
       <w:pPr>
+        <w:pStyle w:val="ListParagraph"/>
+        <w:numPr>
+          <w:ilvl w:val="0"/>
+          <w:numId w:val="2"/>
+        </w:numPr>
         <w:spacing w:after="0"/>
         <w:jc w:val="both"/>
         <w:rPr>
@@ -19645,7 +19895,7 @@
           <w:szCs w:val="26"/>
         </w:rPr>
       </w:pPr>
-      <w:bookmarkStart w:id="24" w:name="_Toc226205048"/>
+      <w:bookmarkStart w:id="24" w:name="_Toc226470173"/>
       <w:r>
         <w:rPr>
           <w:rFonts w:ascii="Times New Roman" w:hAnsi="Times New Roman" w:cs="Times New Roman"/>
@@ -19745,6 +19995,11 @@
     </w:p>
     <w:p>
       <w:pPr>
+        <w:pStyle w:val="ListParagraph"/>
+        <w:numPr>
+          <w:ilvl w:val="0"/>
+          <w:numId w:val="2"/>
+        </w:numPr>
         <w:spacing w:after="0"/>
         <w:jc w:val="both"/>
         <w:rPr>
@@ -19764,6 +20019,11 @@
     </w:p>
     <w:p>
       <w:pPr>
+        <w:pStyle w:val="ListParagraph"/>
+        <w:numPr>
+          <w:ilvl w:val="0"/>
+          <w:numId w:val="2"/>
+        </w:numPr>
         <w:spacing w:after="0"/>
         <w:jc w:val="both"/>
         <w:rPr>
@@ -19783,6 +20043,11 @@
     </w:p>
     <w:p>
       <w:pPr>
+        <w:pStyle w:val="ListParagraph"/>
+        <w:numPr>
+          <w:ilvl w:val="0"/>
+          <w:numId w:val="2"/>
+        </w:numPr>
         <w:spacing w:after="0"/>
         <w:jc w:val="both"/>
         <w:rPr>
@@ -20166,7 +20431,7 @@
           <w:szCs w:val="26"/>
         </w:rPr>
       </w:pPr>
-      <w:bookmarkStart w:id="25" w:name="_Toc226205049"/>
+      <w:bookmarkStart w:id="25" w:name="_Toc226470174"/>
       <w:r>
         <w:rPr>
           <w:rFonts w:ascii="Times New Roman" w:hAnsi="Times New Roman" w:cs="Times New Roman"/>
@@ -20211,6 +20476,86 @@
           <w:szCs w:val="26"/>
         </w:rPr>
         <w:t xml:space="preserve"> </w:t>
+      </w:r>
+    </w:p>
+    <w:p>
+      <w:pPr>
+        <w:spacing w:after="0"/>
+        <w:ind w:firstLine="720"/>
+        <w:jc w:val="both"/>
+        <w:rPr>
+          <w:rFonts w:ascii="Times New Roman" w:hAnsi="Times New Roman" w:cs="Times New Roman"/>
+          <w:sz w:val="26"/>
+          <w:szCs w:val="26"/>
+        </w:rPr>
+      </w:pPr>
+      <w:r>
+        <w:rPr>
+          <w:rFonts w:ascii="Times New Roman" w:hAnsi="Times New Roman" w:cs="Times New Roman"/>
+          <w:sz w:val="26"/>
+          <w:szCs w:val="26"/>
+        </w:rPr>
+        <w:t xml:space="preserve">Ai cũng đã biết trò chơi caro với hai ký hiệu X và O. Hai người chơi lần lượt viết ký hiệu của mình lên trên lưới các ô vuông. Một bên được gọi là thắng cuộc nếu có 5 ký hiệu của mình xếp thành một đường thẳng (ngang, dọc, chéo). </w:t>
+      </w:r>
+    </w:p>
+    <w:p>
+      <w:pPr>
+        <w:spacing w:after="0"/>
+        <w:ind w:firstLine="720"/>
+        <w:jc w:val="both"/>
+        <w:rPr>
+          <w:rFonts w:ascii="Times New Roman" w:hAnsi="Times New Roman" w:cs="Times New Roman"/>
+          <w:sz w:val="26"/>
+          <w:szCs w:val="26"/>
+        </w:rPr>
+      </w:pPr>
+      <w:r>
+        <w:rPr>
+          <w:rFonts w:ascii="Times New Roman" w:hAnsi="Times New Roman" w:cs="Times New Roman"/>
+          <w:sz w:val="26"/>
+          <w:szCs w:val="26"/>
+        </w:rPr>
+        <w:t>Phiên bản caro ngang đơn giản hơn nhiều. Trò chơi chỉ thực hiện trên một đường thẳng với không quá N ô vuông. Luật chơi thay đổi một chút để cho mỗi người chơi có thể “tranh nhau" viết càng nhanh càng tốt ký hiệu của mình, không cần chờ đến lượt.</w:t>
+      </w:r>
+    </w:p>
+    <w:p>
+      <w:pPr>
+        <w:spacing w:after="0"/>
+        <w:ind w:firstLine="720"/>
+        <w:jc w:val="both"/>
+        <w:rPr>
+          <w:rFonts w:ascii="Times New Roman" w:hAnsi="Times New Roman" w:cs="Times New Roman"/>
+          <w:sz w:val="26"/>
+          <w:szCs w:val="26"/>
+        </w:rPr>
+      </w:pPr>
+      <w:r>
+        <w:rPr>
+          <w:rFonts w:ascii="Times New Roman" w:hAnsi="Times New Roman" w:cs="Times New Roman"/>
+          <w:sz w:val="26"/>
+          <w:szCs w:val="26"/>
+        </w:rPr>
+        <w:t>Khi kết thúc một ván chơi thì tất cả N ô vuông đều đã được điền O hoặc X. Người chơi thắng cuộc khi có dãy ký hiệu giống nhau liên tiếp dài hơn người kia và đảm bảo lớn hơn hoặc bằng 5. Nếu hai người chơi đều có dãy liên tiếp dài nhất bằng nhau thì coi như “hòa”.</w:t>
+      </w:r>
+    </w:p>
+    <w:p>
+      <w:pPr>
+        <w:spacing w:after="0"/>
+        <w:ind w:firstLine="720"/>
+        <w:jc w:val="both"/>
+        <w:rPr>
+          <w:rFonts w:ascii="Times New Roman" w:hAnsi="Times New Roman" w:cs="Times New Roman"/>
+          <w:sz w:val="26"/>
+          <w:szCs w:val="26"/>
+        </w:rPr>
+      </w:pPr>
+      <w:r>
+        <w:rPr>
+          <w:rFonts w:ascii="Times New Roman" w:hAnsi="Times New Roman" w:cs="Times New Roman"/>
+          <w:sz w:val="26"/>
+          <w:szCs w:val="26"/>
+        </w:rPr>
+        <w:t>Cho số N là số ô vuông thẳng hàng cùng với ký hiệu được lựa chọn. Hãy liệt kê tất cả các trường hợp giúp người chơi có ký hiệu đỏ thắng cuộc. Các trường hợp cần liệt kê theo thứ tự từ điển.</w:t>
       </w:r>
     </w:p>
     <w:p>
@@ -20219,21 +20564,31 @@
         <w:jc w:val="both"/>
         <w:rPr>
           <w:rFonts w:ascii="Times New Roman" w:hAnsi="Times New Roman" w:cs="Times New Roman"/>
-          <w:sz w:val="26"/>
-          <w:szCs w:val="26"/>
-        </w:rPr>
-      </w:pPr>
-      <w:r>
-        <w:rPr>
-          <w:rFonts w:ascii="Times New Roman" w:hAnsi="Times New Roman" w:cs="Times New Roman"/>
-          <w:sz w:val="26"/>
-          <w:szCs w:val="26"/>
-        </w:rPr>
-        <w:t xml:space="preserve">Ai cũng đã biết trò chơi caro với hai ký hiệu X và O. Hai người chơi lần lượt viết ký hiệu của mình lên trên lưới các ô vuông. Một bên được gọi là thắng cuộc nếu có 5 ký hiệu của mình xếp thành một đường thẳng (ngang, dọc, chéo). </w:t>
-      </w:r>
-    </w:p>
-    <w:p>
-      <w:pPr>
+          <w:b/>
+          <w:bCs/>
+          <w:sz w:val="26"/>
+          <w:szCs w:val="26"/>
+        </w:rPr>
+      </w:pPr>
+      <w:r>
+        <w:rPr>
+          <w:rFonts w:ascii="Times New Roman" w:hAnsi="Times New Roman" w:cs="Times New Roman"/>
+          <w:b/>
+          <w:bCs/>
+          <w:sz w:val="26"/>
+          <w:szCs w:val="26"/>
+        </w:rPr>
+        <w:lastRenderedPageBreak/>
+        <w:t>Input</w:t>
+      </w:r>
+    </w:p>
+    <w:p>
+      <w:pPr>
+        <w:pStyle w:val="ListParagraph"/>
+        <w:numPr>
+          <w:ilvl w:val="0"/>
+          <w:numId w:val="2"/>
+        </w:numPr>
         <w:spacing w:after="0"/>
         <w:jc w:val="both"/>
         <w:rPr>
@@ -20248,92 +20603,16 @@
           <w:sz w:val="26"/>
           <w:szCs w:val="26"/>
         </w:rPr>
-        <w:t>Phiên bản caro ngang đơn giản hơn nhiều. Trò chơi chỉ thực hiện trên một đường thẳng với không quá N ô vuông. Luật chơi thay đổi một chút để cho mỗi người chơi có thể “tranh nhau" viết càng nhanh càng tốt ký hiệu của mình, không cần chờ đến lượt.</w:t>
-      </w:r>
-    </w:p>
-    <w:p>
-      <w:pPr>
-        <w:spacing w:after="0"/>
-        <w:jc w:val="both"/>
-        <w:rPr>
-          <w:rFonts w:ascii="Times New Roman" w:hAnsi="Times New Roman" w:cs="Times New Roman"/>
-          <w:sz w:val="26"/>
-          <w:szCs w:val="26"/>
-        </w:rPr>
-      </w:pPr>
-      <w:r>
-        <w:rPr>
-          <w:rFonts w:ascii="Times New Roman" w:hAnsi="Times New Roman" w:cs="Times New Roman"/>
-          <w:sz w:val="26"/>
-          <w:szCs w:val="26"/>
-        </w:rPr>
-        <w:t>Khi kết thúc một ván chơi thì tất cả N ô vuông đều đã được điền O hoặc X. Người chơi thắng cuộc khi có dãy ký hiệu giống nhau liên tiếp dài hơn người kia và đảm bảo lớn hơn hoặc bằng 5. Nếu hai người chơi đều có dãy liên tiếp dài nhất bằng nhau thì coi như “hòa”.</w:t>
-      </w:r>
-    </w:p>
-    <w:p>
-      <w:pPr>
-        <w:spacing w:after="0"/>
-        <w:jc w:val="both"/>
-        <w:rPr>
-          <w:rFonts w:ascii="Times New Roman" w:hAnsi="Times New Roman" w:cs="Times New Roman"/>
-          <w:sz w:val="26"/>
-          <w:szCs w:val="26"/>
-        </w:rPr>
-      </w:pPr>
-      <w:r>
-        <w:rPr>
-          <w:rFonts w:ascii="Times New Roman" w:hAnsi="Times New Roman" w:cs="Times New Roman"/>
-          <w:sz w:val="26"/>
-          <w:szCs w:val="26"/>
-        </w:rPr>
-        <w:t>Cho số N là số ô vuông thẳng hàng cùng với ký hiệu được lựa chọn. Hãy liệt kê tất cả các trường hợp giúp người chơi có ký hiệu đỏ thắng cuộc. Các trường hợp cần liệt kê theo thứ tự từ điển.</w:t>
-      </w:r>
-    </w:p>
-    <w:p>
-      <w:pPr>
-        <w:spacing w:after="0"/>
-        <w:jc w:val="both"/>
-        <w:rPr>
-          <w:rFonts w:ascii="Times New Roman" w:hAnsi="Times New Roman" w:cs="Times New Roman"/>
-          <w:b/>
-          <w:bCs/>
-          <w:sz w:val="26"/>
-          <w:szCs w:val="26"/>
-        </w:rPr>
-      </w:pPr>
-      <w:r>
-        <w:rPr>
-          <w:rFonts w:ascii="Times New Roman" w:hAnsi="Times New Roman" w:cs="Times New Roman"/>
-          <w:b/>
-          <w:bCs/>
-          <w:sz w:val="26"/>
-          <w:szCs w:val="26"/>
-        </w:rPr>
-        <w:lastRenderedPageBreak/>
-        <w:t>Input</w:t>
-      </w:r>
-    </w:p>
-    <w:p>
-      <w:pPr>
-        <w:spacing w:after="0"/>
-        <w:jc w:val="both"/>
-        <w:rPr>
-          <w:rFonts w:ascii="Times New Roman" w:hAnsi="Times New Roman" w:cs="Times New Roman"/>
-          <w:sz w:val="26"/>
-          <w:szCs w:val="26"/>
-        </w:rPr>
-      </w:pPr>
-      <w:r>
-        <w:rPr>
-          <w:rFonts w:ascii="Times New Roman" w:hAnsi="Times New Roman" w:cs="Times New Roman"/>
-          <w:sz w:val="26"/>
-          <w:szCs w:val="26"/>
-        </w:rPr>
         <w:t>Dòng đầu ghi số bộ test T (T &lt; 10).</w:t>
       </w:r>
     </w:p>
     <w:p>
       <w:pPr>
+        <w:pStyle w:val="ListParagraph"/>
+        <w:numPr>
+          <w:ilvl w:val="0"/>
+          <w:numId w:val="2"/>
+        </w:numPr>
         <w:spacing w:after="0"/>
         <w:jc w:val="both"/>
         <w:rPr>
@@ -20710,7 +20989,7 @@
           <w:szCs w:val="26"/>
         </w:rPr>
       </w:pPr>
-      <w:bookmarkStart w:id="26" w:name="_Toc226205050"/>
+      <w:bookmarkStart w:id="26" w:name="_Toc226470175"/>
       <w:r>
         <w:rPr>
           <w:rFonts w:ascii="Times New Roman" w:hAnsi="Times New Roman" w:cs="Times New Roman"/>
@@ -21235,7 +21514,7 @@
           <w:szCs w:val="26"/>
         </w:rPr>
       </w:pPr>
-      <w:bookmarkStart w:id="27" w:name="_Toc226205051"/>
+      <w:bookmarkStart w:id="27" w:name="_Toc226470176"/>
       <w:r>
         <w:rPr>
           <w:rFonts w:ascii="Times New Roman" w:hAnsi="Times New Roman" w:cs="Times New Roman"/>
@@ -22149,7 +22428,7 @@
           <w:szCs w:val="26"/>
         </w:rPr>
       </w:pPr>
-      <w:bookmarkStart w:id="28" w:name="_Toc226205052"/>
+      <w:bookmarkStart w:id="28" w:name="_Toc226470177"/>
       <w:r>
         <w:rPr>
           <w:rFonts w:ascii="Times New Roman" w:hAnsi="Times New Roman" w:cs="Times New Roman"/>
@@ -22243,6 +22522,22 @@
         </w:rPr>
         <w:t>Input</w:t>
       </w:r>
+      <w:r>
+        <w:rPr>
+          <w:rFonts w:ascii="Times New Roman" w:hAnsi="Times New Roman" w:cs="Times New Roman"/>
+          <w:sz w:val="26"/>
+          <w:szCs w:val="26"/>
+        </w:rPr>
+        <w:t xml:space="preserve">. </w:t>
+      </w:r>
+      <w:r>
+        <w:rPr>
+          <w:rFonts w:ascii="Times New Roman" w:hAnsi="Times New Roman" w:cs="Times New Roman"/>
+          <w:sz w:val="26"/>
+          <w:szCs w:val="26"/>
+        </w:rPr>
+        <w:t>Chỉ có 1 số n (2 &lt; n &lt; 16).</w:t>
+      </w:r>
     </w:p>
     <w:p>
       <w:pPr>
@@ -22257,14 +22552,21 @@
       <w:r>
         <w:rPr>
           <w:rFonts w:ascii="Times New Roman" w:hAnsi="Times New Roman" w:cs="Times New Roman"/>
-          <w:sz w:val="26"/>
-          <w:szCs w:val="26"/>
-        </w:rPr>
-        <w:t>Chỉ có 1 số n (2 &lt; n &lt; 16).</w:t>
-      </w:r>
-    </w:p>
-    <w:p>
-      <w:pPr>
+          <w:b/>
+          <w:bCs/>
+          <w:sz w:val="26"/>
+          <w:szCs w:val="26"/>
+        </w:rPr>
+        <w:t>Output</w:t>
+      </w:r>
+    </w:p>
+    <w:p>
+      <w:pPr>
+        <w:pStyle w:val="ListParagraph"/>
+        <w:numPr>
+          <w:ilvl w:val="0"/>
+          <w:numId w:val="10"/>
+        </w:numPr>
         <w:spacing w:after="0" w:line="276" w:lineRule="auto"/>
         <w:jc w:val="both"/>
         <w:rPr>
@@ -22276,16 +22578,19 @@
       <w:r>
         <w:rPr>
           <w:rFonts w:ascii="Times New Roman" w:hAnsi="Times New Roman" w:cs="Times New Roman"/>
-          <w:b/>
-          <w:bCs/>
-          <w:sz w:val="26"/>
-          <w:szCs w:val="26"/>
-        </w:rPr>
-        <w:t>Output</w:t>
-      </w:r>
-    </w:p>
-    <w:p>
-      <w:pPr>
+          <w:sz w:val="26"/>
+          <w:szCs w:val="26"/>
+        </w:rPr>
+        <w:t>Ghi ra lần lượt các xâu nhị phân chẵn theo thứ tự từ điển, mỗi xâu trên một dòng.</w:t>
+      </w:r>
+    </w:p>
+    <w:p>
+      <w:pPr>
+        <w:pStyle w:val="ListParagraph"/>
+        <w:numPr>
+          <w:ilvl w:val="0"/>
+          <w:numId w:val="10"/>
+        </w:numPr>
         <w:spacing w:after="0" w:line="276" w:lineRule="auto"/>
         <w:jc w:val="both"/>
         <w:rPr>
@@ -22300,40 +22605,25 @@
           <w:sz w:val="26"/>
           <w:szCs w:val="26"/>
         </w:rPr>
-        <w:t>Ghi ra lần lượt các xâu nhị phân chẵn theo thứ tự từ điển, mỗi xâu trên một dòng.</w:t>
+        <w:t>Các số 0-1 trong mỗi xâu cách nhau đúng một khoảng trống.</w:t>
       </w:r>
     </w:p>
     <w:p>
       <w:pPr>
         <w:spacing w:after="0" w:line="276" w:lineRule="auto"/>
-        <w:jc w:val="both"/>
-        <w:rPr>
-          <w:rFonts w:ascii="Times New Roman" w:hAnsi="Times New Roman" w:cs="Times New Roman"/>
-          <w:sz w:val="26"/>
-          <w:szCs w:val="26"/>
-        </w:rPr>
-      </w:pPr>
-      <w:r>
-        <w:rPr>
-          <w:rFonts w:ascii="Times New Roman" w:hAnsi="Times New Roman" w:cs="Times New Roman"/>
-          <w:sz w:val="26"/>
-          <w:szCs w:val="26"/>
-        </w:rPr>
-        <w:t>Các số 0-1 trong mỗi xâu cách nhau đúng một khoảng trống.</w:t>
-      </w:r>
-    </w:p>
-    <w:p>
-      <w:pPr>
-        <w:spacing w:after="0" w:line="276" w:lineRule="auto"/>
-        <w:rPr>
-          <w:rFonts w:ascii="Times New Roman" w:hAnsi="Times New Roman" w:cs="Times New Roman"/>
-          <w:sz w:val="26"/>
-          <w:szCs w:val="26"/>
-        </w:rPr>
-      </w:pPr>
-      <w:r>
-        <w:rPr>
-          <w:rFonts w:ascii="Times New Roman" w:hAnsi="Times New Roman" w:cs="Times New Roman"/>
+        <w:rPr>
+          <w:rFonts w:ascii="Times New Roman" w:hAnsi="Times New Roman" w:cs="Times New Roman"/>
+          <w:b/>
+          <w:bCs/>
+          <w:sz w:val="26"/>
+          <w:szCs w:val="26"/>
+        </w:rPr>
+      </w:pPr>
+      <w:r>
+        <w:rPr>
+          <w:rFonts w:ascii="Times New Roman" w:hAnsi="Times New Roman" w:cs="Times New Roman"/>
+          <w:b/>
+          <w:bCs/>
           <w:sz w:val="26"/>
           <w:szCs w:val="26"/>
         </w:rPr>
@@ -22638,7 +22928,7 @@
           <w:szCs w:val="26"/>
         </w:rPr>
       </w:pPr>
-      <w:bookmarkStart w:id="29" w:name="_Toc226205053"/>
+      <w:bookmarkStart w:id="29" w:name="_Toc226470178"/>
       <w:r>
         <w:rPr>
           <w:rFonts w:ascii="Times New Roman" w:hAnsi="Times New Roman" w:cs="Times New Roman"/>
@@ -22730,16 +23020,14 @@
         </w:rPr>
         <w:t>Input</w:t>
       </w:r>
-    </w:p>
-    <w:p>
-      <w:pPr>
-        <w:spacing w:after="0" w:line="276" w:lineRule="auto"/>
-        <w:rPr>
-          <w:rFonts w:ascii="Times New Roman" w:hAnsi="Times New Roman" w:cs="Times New Roman"/>
-          <w:sz w:val="26"/>
-          <w:szCs w:val="26"/>
-        </w:rPr>
-      </w:pPr>
+      <w:r>
+        <w:rPr>
+          <w:rFonts w:ascii="Times New Roman" w:hAnsi="Times New Roman" w:cs="Times New Roman"/>
+          <w:sz w:val="26"/>
+          <w:szCs w:val="26"/>
+        </w:rPr>
+        <w:t xml:space="preserve">. </w:t>
+      </w:r>
       <w:r>
         <w:rPr>
           <w:rFonts w:ascii="Times New Roman" w:hAnsi="Times New Roman" w:cs="Times New Roman"/>
@@ -23069,7 +23357,7 @@
           <w:szCs w:val="26"/>
         </w:rPr>
       </w:pPr>
-      <w:bookmarkStart w:id="30" w:name="_Toc226205054"/>
+      <w:bookmarkStart w:id="30" w:name="_Toc226470179"/>
       <w:r>
         <w:rPr>
           <w:rFonts w:ascii="Times New Roman" w:hAnsi="Times New Roman" w:cs="Times New Roman"/>
@@ -23108,6 +23396,7 @@
     <w:p>
       <w:pPr>
         <w:spacing w:after="0"/>
+        <w:ind w:firstLine="720"/>
         <w:jc w:val="both"/>
         <w:rPr>
           <w:rFonts w:ascii="Times New Roman" w:hAnsi="Times New Roman" w:cs="Times New Roman"/>
@@ -23121,12 +23410,13 @@
           <w:sz w:val="26"/>
           <w:szCs w:val="26"/>
         </w:rPr>
-        <w:t xml:space="preserve">Cho dãy số A có N số nguyên dương không quá 9 chữ số. </w:t>
+        <w:t>Cho một xâu ký tự S có N từ chỉ bao gồm các chữ cái viết hoa.</w:t>
       </w:r>
     </w:p>
     <w:p>
       <w:pPr>
         <w:spacing w:after="0"/>
+        <w:ind w:firstLine="720"/>
         <w:jc w:val="both"/>
         <w:rPr>
           <w:rFonts w:ascii="Times New Roman" w:hAnsi="Times New Roman" w:cs="Times New Roman"/>
@@ -23140,26 +23430,7 @@
           <w:sz w:val="26"/>
           <w:szCs w:val="26"/>
         </w:rPr>
-        <w:t xml:space="preserve">Hãy tạo ra các dãy ký tự số khác nhau bằng cách ghép các số trong dãy A lại với nhau, có thể ghép với bất cứ số lượng nào từ 1 đến N xâu cũng được, nhưng cần giữ nguyên thứ tự trước sau của các xâu đã được cho ban đầu </w:t>
-      </w:r>
-    </w:p>
-    <w:p>
-      <w:pPr>
-        <w:spacing w:after="0"/>
-        <w:jc w:val="both"/>
-        <w:rPr>
-          <w:rFonts w:ascii="Times New Roman" w:hAnsi="Times New Roman" w:cs="Times New Roman"/>
-          <w:sz w:val="26"/>
-          <w:szCs w:val="26"/>
-        </w:rPr>
-      </w:pPr>
-      <w:r>
-        <w:rPr>
-          <w:rFonts w:ascii="Times New Roman" w:hAnsi="Times New Roman" w:cs="Times New Roman"/>
-          <w:sz w:val="26"/>
-          <w:szCs w:val="26"/>
-        </w:rPr>
-        <w:t>Liệt kê các dãy ký tự số khác nhau tạo được theo thứ tự từ điển.</w:t>
+        <w:t>Hãy liệt kê tất cả các từ khác nhau tạo được bằng cách ghép các từ trong xâu S lại với nhau, có thể ghép với bất cứ số lượng từ 1 đến đủ N từ nhưng vẫn giữ nguyên thứ tự trước sau như trong xâu ban đầu.</w:t>
       </w:r>
     </w:p>
     <w:p>
@@ -23204,23 +23475,7 @@
           <w:sz w:val="26"/>
           <w:szCs w:val="26"/>
         </w:rPr>
-        <w:t xml:space="preserve">Dòng đầu ghi số N và K (1 &lt; N &lt; </w:t>
-      </w:r>
-      <w:r>
-        <w:rPr>
-          <w:rFonts w:ascii="Times New Roman" w:hAnsi="Times New Roman" w:cs="Times New Roman"/>
-          <w:sz w:val="26"/>
-          <w:szCs w:val="26"/>
-        </w:rPr>
-        <w:t>17</w:t>
-      </w:r>
-      <w:r>
-        <w:rPr>
-          <w:rFonts w:ascii="Times New Roman" w:hAnsi="Times New Roman" w:cs="Times New Roman"/>
-          <w:sz w:val="26"/>
-          <w:szCs w:val="26"/>
-        </w:rPr>
-        <w:t xml:space="preserve">). </w:t>
+        <w:t>Dòng đầu ghi số N (1 &lt; N &lt; 16).</w:t>
       </w:r>
     </w:p>
     <w:p>
@@ -23244,7 +23499,7 @@
           <w:sz w:val="26"/>
           <w:szCs w:val="26"/>
         </w:rPr>
-        <w:t xml:space="preserve">Dòng thứ 2 ghi lần lượt N số nguyên dương, các số đều không quá 9 chữ số và có thể trùng nhau. </w:t>
+        <w:t>Dòng thứ 2 ghi lần lượt N từ, mỗi từ có độ dài lớn hơn 1 nhưng không quá 20, các từ có thể trùng nhau.</w:t>
       </w:r>
     </w:p>
     <w:p>
@@ -23273,7 +23528,7 @@
           <w:sz w:val="26"/>
           <w:szCs w:val="26"/>
         </w:rPr>
-        <w:t>Ghi ra các dãy chữ số khác nhau tạo được theo thứ tự từ điển</w:t>
+        <w:t>Ghi ra các từ khác nhau tạo được theo thứ tự từ điển.</w:t>
       </w:r>
     </w:p>
     <w:p>
@@ -23412,7 +23667,7 @@
                 <w:sz w:val="26"/>
                 <w:szCs w:val="26"/>
               </w:rPr>
-              <w:t xml:space="preserve">4 </w:t>
+              <w:t>4</w:t>
             </w:r>
           </w:p>
           <w:p>
@@ -23430,7 +23685,7 @@
                 <w:sz w:val="26"/>
                 <w:szCs w:val="26"/>
               </w:rPr>
-              <w:t>12 21 21 12</w:t>
+              <w:t>ABA BBA AAA AAA</w:t>
             </w:r>
           </w:p>
         </w:tc>
@@ -23459,7 +23714,7 @@
                 <w:sz w:val="26"/>
                 <w:szCs w:val="26"/>
               </w:rPr>
-              <w:t>12</w:t>
+              <w:t>AAA</w:t>
             </w:r>
           </w:p>
           <w:p>
@@ -23477,7 +23732,7 @@
                 <w:sz w:val="26"/>
                 <w:szCs w:val="26"/>
               </w:rPr>
-              <w:t>1212</w:t>
+              <w:t>AAAAAA</w:t>
             </w:r>
           </w:p>
           <w:p>
@@ -23495,7 +23750,7 @@
                 <w:sz w:val="26"/>
                 <w:szCs w:val="26"/>
               </w:rPr>
-              <w:t>1221</w:t>
+              <w:t>ABA</w:t>
             </w:r>
           </w:p>
           <w:p>
@@ -23513,7 +23768,7 @@
                 <w:sz w:val="26"/>
                 <w:szCs w:val="26"/>
               </w:rPr>
-              <w:t>122112</w:t>
+              <w:t>ABAAAA</w:t>
             </w:r>
           </w:p>
           <w:p>
@@ -23531,7 +23786,7 @@
                 <w:sz w:val="26"/>
                 <w:szCs w:val="26"/>
               </w:rPr>
-              <w:t>122121</w:t>
+              <w:t>ABAAAAAAA</w:t>
             </w:r>
           </w:p>
           <w:p>
@@ -23549,7 +23804,7 @@
                 <w:sz w:val="26"/>
                 <w:szCs w:val="26"/>
               </w:rPr>
-              <w:t>12212112</w:t>
+              <w:t>ABABBA</w:t>
             </w:r>
           </w:p>
           <w:p>
@@ -23567,7 +23822,7 @@
                 <w:sz w:val="26"/>
                 <w:szCs w:val="26"/>
               </w:rPr>
-              <w:t>21</w:t>
+              <w:t>ABABBAAAA</w:t>
             </w:r>
           </w:p>
           <w:p>
@@ -23585,7 +23840,7 @@
                 <w:sz w:val="26"/>
                 <w:szCs w:val="26"/>
               </w:rPr>
-              <w:t>2112</w:t>
+              <w:t>ABABBAAAAAAA</w:t>
             </w:r>
           </w:p>
           <w:p>
@@ -23603,7 +23858,7 @@
                 <w:sz w:val="26"/>
                 <w:szCs w:val="26"/>
               </w:rPr>
-              <w:t>2121</w:t>
+              <w:t>BBA</w:t>
             </w:r>
           </w:p>
           <w:p>
@@ -23621,7 +23876,25 @@
                 <w:sz w:val="26"/>
                 <w:szCs w:val="26"/>
               </w:rPr>
-              <w:t>212112</w:t>
+              <w:t>BBAAAA</w:t>
+            </w:r>
+          </w:p>
+          <w:p>
+            <w:pPr>
+              <w:spacing w:after="0" w:line="276" w:lineRule="auto"/>
+              <w:rPr>
+                <w:rFonts w:ascii="Times New Roman" w:hAnsi="Times New Roman" w:cs="Times New Roman"/>
+                <w:sz w:val="26"/>
+                <w:szCs w:val="26"/>
+              </w:rPr>
+            </w:pPr>
+            <w:r>
+              <w:rPr>
+                <w:rFonts w:ascii="Times New Roman" w:hAnsi="Times New Roman" w:cs="Times New Roman"/>
+                <w:sz w:val="26"/>
+                <w:szCs w:val="26"/>
+              </w:rPr>
+              <w:t>BBAAAAAAA</w:t>
             </w:r>
           </w:p>
         </w:tc>
@@ -23641,6 +23914,18 @@
     </w:p>
     <w:p>
       <w:pPr>
+        <w:spacing w:after="0" w:line="276" w:lineRule="auto"/>
+        <w:rPr>
+          <w:rFonts w:ascii="Times New Roman" w:hAnsi="Times New Roman" w:cs="Times New Roman"/>
+          <w:b/>
+          <w:bCs/>
+          <w:sz w:val="26"/>
+          <w:szCs w:val="26"/>
+        </w:rPr>
+      </w:pPr>
+    </w:p>
+    <w:p>
+      <w:pPr>
         <w:pStyle w:val="Heading1"/>
         <w:spacing w:before="0" w:after="0" w:line="276" w:lineRule="auto"/>
         <w:rPr>
@@ -23652,7 +23937,7 @@
           <w:szCs w:val="26"/>
         </w:rPr>
       </w:pPr>
-      <w:bookmarkStart w:id="31" w:name="_Toc226205055"/>
+      <w:bookmarkStart w:id="31" w:name="_Toc226470180"/>
       <w:r>
         <w:rPr>
           <w:rFonts w:ascii="Times New Roman" w:hAnsi="Times New Roman" w:cs="Times New Roman"/>
@@ -23705,7 +23990,7 @@
           <w:sz w:val="26"/>
           <w:szCs w:val="26"/>
         </w:rPr>
-        <w:t xml:space="preserve">Cho dãy số A có N số nguyên dương không quá 9 chữ số. </w:t>
+        <w:t>Cho một xâu ký tự S có N từ chỉ bao gồm các chữ cái viết hoa.</w:t>
       </w:r>
     </w:p>
     <w:p>
@@ -23724,26 +24009,7 @@
           <w:sz w:val="26"/>
           <w:szCs w:val="26"/>
         </w:rPr>
-        <w:t xml:space="preserve">Hãy tạo ra các dãy ký tự số khác nhau bằng cách ghép đúng K số trong dãy A lại với nhau, các số được ghép theo đúng thứ tự trước sau như trong dãy ban đầu. </w:t>
-      </w:r>
-    </w:p>
-    <w:p>
-      <w:pPr>
-        <w:spacing w:after="0"/>
-        <w:jc w:val="both"/>
-        <w:rPr>
-          <w:rFonts w:ascii="Times New Roman" w:hAnsi="Times New Roman" w:cs="Times New Roman"/>
-          <w:sz w:val="26"/>
-          <w:szCs w:val="26"/>
-        </w:rPr>
-      </w:pPr>
-      <w:r>
-        <w:rPr>
-          <w:rFonts w:ascii="Times New Roman" w:hAnsi="Times New Roman" w:cs="Times New Roman"/>
-          <w:sz w:val="26"/>
-          <w:szCs w:val="26"/>
-        </w:rPr>
-        <w:t>Liệt kê các dãy ký tự số khác nhau tạo được theo thứ tự từ điển.</w:t>
+        <w:t>Hãy liệt kê tất cả các từ khác nhau tạo được bằng cách ghép đúng K từ trong xâu S lại với nhau, vẫn giữ nguyên thứ tự trước sau như trong xâu ban đầu.</w:t>
       </w:r>
     </w:p>
     <w:p>
@@ -23788,7 +24054,7 @@
           <w:sz w:val="26"/>
           <w:szCs w:val="26"/>
         </w:rPr>
-        <w:t xml:space="preserve">Dòng đầu ghi số N và K (1 &lt; K &lt; N &lt; 16). </w:t>
+        <w:t>Dòng đầu ghi số N và số K (1 &lt; K &lt; N &lt; 16).</w:t>
       </w:r>
     </w:p>
     <w:p>
@@ -23812,7 +24078,7 @@
           <w:sz w:val="26"/>
           <w:szCs w:val="26"/>
         </w:rPr>
-        <w:t xml:space="preserve">Dòng thứ 2 ghi lần lượt N số nguyên dương, các số đều không quá 9 chữ số và có thể trùng nhau. </w:t>
+        <w:t>Dòng thứ 2 ghi lần lượt N từ, mỗi từ có độ dài lớn hơn 1 nhưng không quá 20, các từ có thể trùng nhau.</w:t>
       </w:r>
     </w:p>
     <w:p>
@@ -23841,7 +24107,7 @@
           <w:sz w:val="26"/>
           <w:szCs w:val="26"/>
         </w:rPr>
-        <w:t>Ghi ra các dãy chữ số khác nhau tạo được theo thứ tự từ điển</w:t>
+        <w:t>Ghi ra các từ khác nhau tạo được theo thứ tự từ điển.</w:t>
       </w:r>
     </w:p>
     <w:p>
@@ -23879,8 +24145,8 @@
         <w:tblLook w:val="04A0" w:firstRow="1" w:lastRow="0" w:firstColumn="1" w:lastColumn="0" w:noHBand="0" w:noVBand="1"/>
       </w:tblPr>
       <w:tblGrid>
-        <w:gridCol w:w="4515"/>
-        <w:gridCol w:w="5116"/>
+        <w:gridCol w:w="4812"/>
+        <w:gridCol w:w="4819"/>
       </w:tblGrid>
       <w:tr>
         <w:trPr>
@@ -23888,7 +24154,7 @@
         </w:trPr>
         <w:tc>
           <w:tcPr>
-            <w:tcW w:w="4515" w:type="dxa"/>
+            <w:tcW w:w="4812" w:type="dxa"/>
             <w:tcBorders>
               <w:top w:val="single" w:sz="6" w:space="0" w:color="000000"/>
               <w:left w:val="single" w:sz="6" w:space="0" w:color="000000"/>
@@ -23921,7 +24187,7 @@
         </w:tc>
         <w:tc>
           <w:tcPr>
-            <w:tcW w:w="5116" w:type="dxa"/>
+            <w:tcW w:w="4819" w:type="dxa"/>
             <w:tcBorders>
               <w:top w:val="single" w:sz="6" w:space="0" w:color="000000"/>
               <w:left w:val="nil"/>
@@ -23956,7 +24222,7 @@
       <w:tr>
         <w:tc>
           <w:tcPr>
-            <w:tcW w:w="4515" w:type="dxa"/>
+            <w:tcW w:w="4812" w:type="dxa"/>
             <w:tcBorders>
               <w:top w:val="nil"/>
               <w:left w:val="single" w:sz="6" w:space="0" w:color="000000"/>
@@ -23998,13 +24264,13 @@
                 <w:sz w:val="26"/>
                 <w:szCs w:val="26"/>
               </w:rPr>
-              <w:t>123 231 211 122</w:t>
+              <w:t>ABA BBA AAA AAA</w:t>
             </w:r>
           </w:p>
         </w:tc>
         <w:tc>
           <w:tcPr>
-            <w:tcW w:w="5116" w:type="dxa"/>
+            <w:tcW w:w="4819" w:type="dxa"/>
             <w:tcBorders>
               <w:top w:val="nil"/>
               <w:left w:val="nil"/>
@@ -24027,7 +24293,7 @@
                 <w:sz w:val="26"/>
                 <w:szCs w:val="26"/>
               </w:rPr>
-              <w:t>123122</w:t>
+              <w:t>AAAAAA</w:t>
             </w:r>
           </w:p>
           <w:p>
@@ -24045,7 +24311,7 @@
                 <w:sz w:val="26"/>
                 <w:szCs w:val="26"/>
               </w:rPr>
-              <w:t>123211</w:t>
+              <w:t>ABAAAA</w:t>
             </w:r>
           </w:p>
           <w:p>
@@ -24063,7 +24329,7 @@
                 <w:sz w:val="26"/>
                 <w:szCs w:val="26"/>
               </w:rPr>
-              <w:t>123231</w:t>
+              <w:t>ABABBA</w:t>
             </w:r>
           </w:p>
           <w:p>
@@ -24081,43 +24347,7 @@
                 <w:sz w:val="26"/>
                 <w:szCs w:val="26"/>
               </w:rPr>
-              <w:t>211122</w:t>
-            </w:r>
-          </w:p>
-          <w:p>
-            <w:pPr>
-              <w:spacing w:after="0" w:line="276" w:lineRule="auto"/>
-              <w:rPr>
-                <w:rFonts w:ascii="Times New Roman" w:hAnsi="Times New Roman" w:cs="Times New Roman"/>
-                <w:sz w:val="26"/>
-                <w:szCs w:val="26"/>
-              </w:rPr>
-            </w:pPr>
-            <w:r>
-              <w:rPr>
-                <w:rFonts w:ascii="Times New Roman" w:hAnsi="Times New Roman" w:cs="Times New Roman"/>
-                <w:sz w:val="26"/>
-                <w:szCs w:val="26"/>
-              </w:rPr>
-              <w:t>231122</w:t>
-            </w:r>
-          </w:p>
-          <w:p>
-            <w:pPr>
-              <w:spacing w:after="0" w:line="276" w:lineRule="auto"/>
-              <w:rPr>
-                <w:rFonts w:ascii="Times New Roman" w:hAnsi="Times New Roman" w:cs="Times New Roman"/>
-                <w:sz w:val="26"/>
-                <w:szCs w:val="26"/>
-              </w:rPr>
-            </w:pPr>
-            <w:r>
-              <w:rPr>
-                <w:rFonts w:ascii="Times New Roman" w:hAnsi="Times New Roman" w:cs="Times New Roman"/>
-                <w:sz w:val="26"/>
-                <w:szCs w:val="26"/>
-              </w:rPr>
-              <w:t>231211</w:t>
+              <w:t>BBAAAA</w:t>
             </w:r>
           </w:p>
         </w:tc>
@@ -24148,7 +24378,7 @@
           <w:szCs w:val="26"/>
         </w:rPr>
       </w:pPr>
-      <w:bookmarkStart w:id="32" w:name="_Toc226205056"/>
+      <w:bookmarkStart w:id="32" w:name="_Toc226470181"/>
       <w:r>
         <w:rPr>
           <w:rFonts w:ascii="Times New Roman" w:hAnsi="Times New Roman" w:cs="Times New Roman"/>
@@ -24354,7 +24584,7 @@
     </w:p>
     <w:tbl>
       <w:tblPr>
-        <w:tblW w:w="0" w:type="auto"/>
+        <w:tblW w:w="9631" w:type="dxa"/>
         <w:tblCellMar>
           <w:top w:w="15" w:type="dxa"/>
           <w:left w:w="15" w:type="dxa"/>
@@ -24364,8 +24594,8 @@
         <w:tblLook w:val="04A0" w:firstRow="1" w:lastRow="0" w:firstColumn="1" w:lastColumn="0" w:noHBand="0" w:noVBand="1"/>
       </w:tblPr>
       <w:tblGrid>
-        <w:gridCol w:w="4515"/>
-        <w:gridCol w:w="4515"/>
+        <w:gridCol w:w="4812"/>
+        <w:gridCol w:w="4819"/>
       </w:tblGrid>
       <w:tr>
         <w:trPr>
@@ -24373,7 +24603,7 @@
         </w:trPr>
         <w:tc>
           <w:tcPr>
-            <w:tcW w:w="4515" w:type="dxa"/>
+            <w:tcW w:w="4812" w:type="dxa"/>
             <w:tcBorders>
               <w:top w:val="single" w:sz="6" w:space="0" w:color="000000"/>
               <w:left w:val="single" w:sz="6" w:space="0" w:color="000000"/>
@@ -24406,7 +24636,7 @@
         </w:tc>
         <w:tc>
           <w:tcPr>
-            <w:tcW w:w="4515" w:type="dxa"/>
+            <w:tcW w:w="4819" w:type="dxa"/>
             <w:tcBorders>
               <w:top w:val="single" w:sz="6" w:space="0" w:color="000000"/>
               <w:left w:val="nil"/>
@@ -24441,7 +24671,7 @@
       <w:tr>
         <w:tc>
           <w:tcPr>
-            <w:tcW w:w="4515" w:type="dxa"/>
+            <w:tcW w:w="4812" w:type="dxa"/>
             <w:tcBorders>
               <w:top w:val="nil"/>
               <w:left w:val="single" w:sz="6" w:space="0" w:color="000000"/>
@@ -24471,7 +24701,7 @@
         </w:tc>
         <w:tc>
           <w:tcPr>
-            <w:tcW w:w="4515" w:type="dxa"/>
+            <w:tcW w:w="4819" w:type="dxa"/>
             <w:tcBorders>
               <w:top w:val="nil"/>
               <w:left w:val="nil"/>
@@ -24640,6 +24870,42 @@
     </w:p>
     <w:p>
       <w:pPr>
+        <w:spacing w:after="0" w:line="276" w:lineRule="auto"/>
+        <w:rPr>
+          <w:rFonts w:ascii="Times New Roman" w:hAnsi="Times New Roman" w:cs="Times New Roman"/>
+          <w:b/>
+          <w:bCs/>
+          <w:sz w:val="26"/>
+          <w:szCs w:val="26"/>
+        </w:rPr>
+      </w:pPr>
+    </w:p>
+    <w:p>
+      <w:pPr>
+        <w:spacing w:after="0" w:line="276" w:lineRule="auto"/>
+        <w:rPr>
+          <w:rFonts w:ascii="Times New Roman" w:hAnsi="Times New Roman" w:cs="Times New Roman"/>
+          <w:b/>
+          <w:bCs/>
+          <w:sz w:val="26"/>
+          <w:szCs w:val="26"/>
+        </w:rPr>
+      </w:pPr>
+    </w:p>
+    <w:p>
+      <w:pPr>
+        <w:spacing w:after="0" w:line="276" w:lineRule="auto"/>
+        <w:rPr>
+          <w:rFonts w:ascii="Times New Roman" w:hAnsi="Times New Roman" w:cs="Times New Roman"/>
+          <w:b/>
+          <w:bCs/>
+          <w:sz w:val="26"/>
+          <w:szCs w:val="26"/>
+        </w:rPr>
+      </w:pPr>
+    </w:p>
+    <w:p>
+      <w:pPr>
         <w:pStyle w:val="Heading1"/>
         <w:spacing w:before="0" w:after="0" w:line="276" w:lineRule="auto"/>
         <w:rPr>
@@ -24651,7 +24917,7 @@
           <w:szCs w:val="26"/>
         </w:rPr>
       </w:pPr>
-      <w:bookmarkStart w:id="33" w:name="_Toc226205057"/>
+      <w:bookmarkStart w:id="33" w:name="_Toc226470182"/>
       <w:r>
         <w:rPr>
           <w:rFonts w:ascii="Times New Roman" w:hAnsi="Times New Roman" w:cs="Times New Roman"/>
@@ -24737,7 +25003,7 @@
           <w:sz w:val="26"/>
           <w:szCs w:val="26"/>
         </w:rPr>
-        <w:t xml:space="preserve">Cho một xâu ký tự S có N từ chỉ gồm các chữ cái viết hoa. </w:t>
+        <w:t>Cho dãy số A có N số nguyên dương không quá 9 chữ số.</w:t>
       </w:r>
     </w:p>
     <w:p>
@@ -24756,7 +25022,7 @@
           <w:sz w:val="26"/>
           <w:szCs w:val="26"/>
         </w:rPr>
-        <w:t>Hãy liệt kê tất cả các từ khác nhau tạo được bằng cách ghép các từ trong xâu S lại với nhau, có thể ghép với bất cứ số lượng từ 1 đến đủ N từ nhưng vẫn giữ nguyên thứ tự trước sau như trong xâu ban đầu</w:t>
+        <w:t xml:space="preserve">Hãy tạo ra các dãy ký tự số khác nhau bằng cách ghép các số trong dãy A lại với nhau, có thể ghép với bất cứ số lượng từ 1 đến đủ N số nhưng vẫn giữ nguyên thứ tự trước sau như trong dãy ban đầu.  </w:t>
       </w:r>
     </w:p>
     <w:p>
@@ -24775,23 +25041,7 @@
           <w:sz w:val="26"/>
           <w:szCs w:val="26"/>
         </w:rPr>
-        <w:t xml:space="preserve">Liệt kê các </w:t>
-      </w:r>
-      <w:r>
-        <w:rPr>
-          <w:rFonts w:ascii="Times New Roman" w:hAnsi="Times New Roman" w:cs="Times New Roman"/>
-          <w:sz w:val="26"/>
-          <w:szCs w:val="26"/>
-        </w:rPr>
-        <w:t>từ</w:t>
-      </w:r>
-      <w:r>
-        <w:rPr>
-          <w:rFonts w:ascii="Times New Roman" w:hAnsi="Times New Roman" w:cs="Times New Roman"/>
-          <w:sz w:val="26"/>
-          <w:szCs w:val="26"/>
-        </w:rPr>
-        <w:t xml:space="preserve"> khác nhau tạo được theo thứ tự từ điển.</w:t>
+        <w:t>Liệt kê các dãy ký tự số khác nhau tạo được theo thứ tự từ điển.</w:t>
       </w:r>
     </w:p>
     <w:p>
@@ -24836,7 +25086,7 @@
           <w:sz w:val="26"/>
           <w:szCs w:val="26"/>
         </w:rPr>
-        <w:t xml:space="preserve">Dòng đầu ghi số N (1 &lt; N &lt; 16). </w:t>
+        <w:t>Dòng đầu ghi số N (1 &lt; N &lt; 16).</w:t>
       </w:r>
     </w:p>
     <w:p>
@@ -24860,31 +25110,15 @@
           <w:sz w:val="26"/>
           <w:szCs w:val="26"/>
         </w:rPr>
-        <w:t xml:space="preserve">Dòng thứ 2 ghi lần lượt </w:t>
-      </w:r>
-      <w:r>
-        <w:rPr>
-          <w:rFonts w:ascii="Times New Roman" w:hAnsi="Times New Roman" w:cs="Times New Roman"/>
-          <w:sz w:val="26"/>
-          <w:szCs w:val="26"/>
-        </w:rPr>
-        <w:t>N từ</w:t>
-      </w:r>
-      <w:r>
-        <w:rPr>
-          <w:rFonts w:ascii="Times New Roman" w:hAnsi="Times New Roman" w:cs="Times New Roman"/>
-          <w:sz w:val="26"/>
-          <w:szCs w:val="26"/>
-        </w:rPr>
-        <w:t xml:space="preserve">, </w:t>
-      </w:r>
-      <w:r>
-        <w:rPr>
-          <w:rFonts w:ascii="Times New Roman" w:hAnsi="Times New Roman" w:cs="Times New Roman"/>
-          <w:sz w:val="26"/>
-          <w:szCs w:val="26"/>
-        </w:rPr>
-        <w:t>mỗi từ có độ dài lớn hơn 1 nhưng không quá 20, các từ có thể trùng nhau</w:t>
+        <w:t>Dòng thứ 2 ghi lần lượt N số nguyên dương, các số đều không quá 9 chữ số và có thể trùng nhau</w:t>
+      </w:r>
+      <w:r>
+        <w:rPr>
+          <w:rFonts w:ascii="Times New Roman" w:hAnsi="Times New Roman" w:cs="Times New Roman"/>
+          <w:sz w:val="26"/>
+          <w:szCs w:val="26"/>
+        </w:rPr>
+        <w:t>.</w:t>
       </w:r>
     </w:p>
     <w:p>
@@ -24913,28 +25147,13 @@
           <w:sz w:val="26"/>
           <w:szCs w:val="26"/>
         </w:rPr>
-        <w:t xml:space="preserve">Ghi ra các </w:t>
-      </w:r>
-      <w:r>
-        <w:rPr>
-          <w:rFonts w:ascii="Times New Roman" w:hAnsi="Times New Roman" w:cs="Times New Roman"/>
-          <w:sz w:val="26"/>
-          <w:szCs w:val="26"/>
-        </w:rPr>
-        <w:t>từ</w:t>
-      </w:r>
-      <w:r>
-        <w:rPr>
-          <w:rFonts w:ascii="Times New Roman" w:hAnsi="Times New Roman" w:cs="Times New Roman"/>
-          <w:sz w:val="26"/>
-          <w:szCs w:val="26"/>
-        </w:rPr>
-        <w:t xml:space="preserve"> khác nhau tạo được theo thứ tự từ điển</w:t>
-      </w:r>
-    </w:p>
-    <w:p>
-      <w:pPr>
-        <w:spacing w:after="0" w:line="276" w:lineRule="auto"/>
+        <w:t>Ghi ra các dãy chữ số khác nhau tạo được theo thứ tự từ điển.</w:t>
+      </w:r>
+    </w:p>
+    <w:p>
+      <w:pPr>
+        <w:spacing w:after="0"/>
+        <w:jc w:val="both"/>
         <w:rPr>
           <w:rFonts w:ascii="Times New Roman" w:hAnsi="Times New Roman" w:cs="Times New Roman"/>
           <w:b/>
@@ -24957,18 +25176,18 @@
     <w:tbl>
       <w:tblPr>
         <w:tblStyle w:val="TableGrid"/>
-        <w:tblW w:w="0" w:type="auto"/>
-        <w:tblInd w:w="137" w:type="dxa"/>
+        <w:tblW w:w="9781" w:type="dxa"/>
+        <w:tblInd w:w="-5" w:type="dxa"/>
         <w:tblLook w:val="04A0" w:firstRow="1" w:lastRow="0" w:firstColumn="1" w:lastColumn="0" w:noHBand="0" w:noVBand="1"/>
       </w:tblPr>
       <w:tblGrid>
-        <w:gridCol w:w="4970"/>
-        <w:gridCol w:w="4522"/>
+        <w:gridCol w:w="4820"/>
+        <w:gridCol w:w="4961"/>
       </w:tblGrid>
       <w:tr>
         <w:tc>
           <w:tcPr>
-            <w:tcW w:w="4970" w:type="dxa"/>
+            <w:tcW w:w="4820" w:type="dxa"/>
             <w:shd w:val="clear" w:color="auto" w:fill="ADADAD" w:themeFill="background2" w:themeFillShade="BF"/>
           </w:tcPr>
           <w:p>
@@ -24994,7 +25213,7 @@
         </w:tc>
         <w:tc>
           <w:tcPr>
-            <w:tcW w:w="4522" w:type="dxa"/>
+            <w:tcW w:w="4961" w:type="dxa"/>
             <w:shd w:val="clear" w:color="auto" w:fill="ADADAD" w:themeFill="background2" w:themeFillShade="BF"/>
           </w:tcPr>
           <w:p>
@@ -25022,7 +25241,7 @@
       <w:tr>
         <w:tc>
           <w:tcPr>
-            <w:tcW w:w="4970" w:type="dxa"/>
+            <w:tcW w:w="4820" w:type="dxa"/>
           </w:tcPr>
           <w:p>
             <w:pPr>
@@ -25057,13 +25276,23 @@
                 <w:sz w:val="26"/>
                 <w:szCs w:val="26"/>
               </w:rPr>
-              <w:t>ABA BBA AAA AAA</w:t>
-            </w:r>
+              <w:t>12 21 21 12</w:t>
+            </w:r>
+          </w:p>
+          <w:p>
+            <w:pPr>
+              <w:spacing w:line="276" w:lineRule="auto"/>
+              <w:rPr>
+                <w:rFonts w:ascii="Times New Roman" w:hAnsi="Times New Roman" w:cs="Times New Roman"/>
+                <w:sz w:val="26"/>
+                <w:szCs w:val="26"/>
+              </w:rPr>
+            </w:pPr>
           </w:p>
         </w:tc>
         <w:tc>
           <w:tcPr>
-            <w:tcW w:w="4522" w:type="dxa"/>
+            <w:tcW w:w="4961" w:type="dxa"/>
           </w:tcPr>
           <w:p>
             <w:pPr>
@@ -25080,7 +25309,7 @@
                 <w:sz w:val="26"/>
                 <w:szCs w:val="26"/>
               </w:rPr>
-              <w:t>AAA</w:t>
+              <w:t>12</w:t>
             </w:r>
           </w:p>
           <w:p>
@@ -25098,7 +25327,7 @@
                 <w:sz w:val="26"/>
                 <w:szCs w:val="26"/>
               </w:rPr>
-              <w:t>AAAAAA</w:t>
+              <w:t>1212</w:t>
             </w:r>
           </w:p>
           <w:p>
@@ -25116,7 +25345,7 @@
                 <w:sz w:val="26"/>
                 <w:szCs w:val="26"/>
               </w:rPr>
-              <w:t>ABA</w:t>
+              <w:t>1221</w:t>
             </w:r>
           </w:p>
           <w:p>
@@ -25134,7 +25363,7 @@
                 <w:sz w:val="26"/>
                 <w:szCs w:val="26"/>
               </w:rPr>
-              <w:t>ABAAAA</w:t>
+              <w:t>122112</w:t>
             </w:r>
           </w:p>
           <w:p>
@@ -25152,7 +25381,7 @@
                 <w:sz w:val="26"/>
                 <w:szCs w:val="26"/>
               </w:rPr>
-              <w:t>ABAAAAAAA</w:t>
+              <w:t>122121</w:t>
             </w:r>
           </w:p>
           <w:p>
@@ -25170,7 +25399,7 @@
                 <w:sz w:val="26"/>
                 <w:szCs w:val="26"/>
               </w:rPr>
-              <w:t>ABABBA</w:t>
+              <w:t>12212112</w:t>
             </w:r>
           </w:p>
           <w:p>
@@ -25188,7 +25417,7 @@
                 <w:sz w:val="26"/>
                 <w:szCs w:val="26"/>
               </w:rPr>
-              <w:t>ABABBAAAA</w:t>
+              <w:t>21</w:t>
             </w:r>
           </w:p>
           <w:p>
@@ -25206,7 +25435,7 @@
                 <w:sz w:val="26"/>
                 <w:szCs w:val="26"/>
               </w:rPr>
-              <w:t>ABABBAAAAAAA</w:t>
+              <w:t>2112</w:t>
             </w:r>
           </w:p>
           <w:p>
@@ -25224,7 +25453,7 @@
                 <w:sz w:val="26"/>
                 <w:szCs w:val="26"/>
               </w:rPr>
-              <w:t>BBA</w:t>
+              <w:t>2121</w:t>
             </w:r>
           </w:p>
           <w:p>
@@ -25242,25 +25471,7 @@
                 <w:sz w:val="26"/>
                 <w:szCs w:val="26"/>
               </w:rPr>
-              <w:t>BBAAAA</w:t>
-            </w:r>
-          </w:p>
-          <w:p>
-            <w:pPr>
-              <w:spacing w:line="276" w:lineRule="auto"/>
-              <w:rPr>
-                <w:rFonts w:ascii="Times New Roman" w:hAnsi="Times New Roman" w:cs="Times New Roman"/>
-                <w:sz w:val="26"/>
-                <w:szCs w:val="26"/>
-              </w:rPr>
-            </w:pPr>
-            <w:r>
-              <w:rPr>
-                <w:rFonts w:ascii="Times New Roman" w:hAnsi="Times New Roman" w:cs="Times New Roman"/>
-                <w:sz w:val="26"/>
-                <w:szCs w:val="26"/>
-              </w:rPr>
-              <w:t>BBAAAAAAA</w:t>
+              <w:t>212112</w:t>
             </w:r>
           </w:p>
         </w:tc>
@@ -25268,18 +25479,6 @@
     </w:tbl>
     <w:p>
       <w:pPr>
-        <w:spacing w:after="0" w:line="276" w:lineRule="auto"/>
-        <w:rPr>
-          <w:rFonts w:ascii="Times New Roman" w:hAnsi="Times New Roman" w:cs="Times New Roman"/>
-          <w:b/>
-          <w:bCs/>
-          <w:sz w:val="26"/>
-          <w:szCs w:val="26"/>
-        </w:rPr>
-      </w:pPr>
-    </w:p>
-    <w:p>
-      <w:pPr>
         <w:pStyle w:val="Heading1"/>
         <w:spacing w:before="0" w:after="0" w:line="276" w:lineRule="auto"/>
         <w:rPr>
@@ -25291,7 +25490,7 @@
           <w:szCs w:val="26"/>
         </w:rPr>
       </w:pPr>
-      <w:bookmarkStart w:id="34" w:name="_Toc226205058"/>
+      <w:bookmarkStart w:id="34" w:name="_Toc226470183"/>
       <w:r>
         <w:rPr>
           <w:rFonts w:ascii="Times New Roman" w:hAnsi="Times New Roman" w:cs="Times New Roman"/>
@@ -25343,7 +25542,7 @@
           <w:sz w:val="26"/>
           <w:szCs w:val="26"/>
         </w:rPr>
-        <w:t xml:space="preserve">Cho một xâu ký tự S có N từ chỉ gồm các chữ cái viết hoa. </w:t>
+        <w:t>Cho dãy số A có N số nguyên dương không quá 9 chữ số.</w:t>
       </w:r>
     </w:p>
     <w:p>
@@ -25362,7 +25561,7 @@
           <w:sz w:val="26"/>
           <w:szCs w:val="26"/>
         </w:rPr>
-        <w:t>Hãy liệt kê tất cả các từ khác nhau tạo được bằng cách ghép đúng K từ trong xâu S lại với nhau, các từ được ghép theo đúng thứ tự trước sau như trong xâu ban đầu</w:t>
+        <w:t>Hãy tạo ra các dãy ký tự số khác nhau bằng cách ghép đúng K số trong dãy A lại với nhau, các số được ghép theo đúng thứ tự trước sau như trong dãy ban đầu.  </w:t>
       </w:r>
     </w:p>
     <w:p>
@@ -25381,7 +25580,7 @@
           <w:sz w:val="26"/>
           <w:szCs w:val="26"/>
         </w:rPr>
-        <w:t>Liệt kê các từ khác nhau tạo được theo thứ tự từ điển.</w:t>
+        <w:t>Liệt kê các dãy ký tự số khác nhau tạo được theo thứ tự từ điển.</w:t>
       </w:r>
     </w:p>
     <w:p>
@@ -25426,7 +25625,7 @@
           <w:sz w:val="26"/>
           <w:szCs w:val="26"/>
         </w:rPr>
-        <w:t xml:space="preserve">Dòng đầu ghi số N và K (1 &lt; K &lt; N &lt; 16). </w:t>
+        <w:t>Dòng đầu ghi số N và K (1 &lt; K &lt; N &lt; 16).</w:t>
       </w:r>
     </w:p>
     <w:p>
@@ -25450,7 +25649,7 @@
           <w:sz w:val="26"/>
           <w:szCs w:val="26"/>
         </w:rPr>
-        <w:t>Dòng thứ 2 ghi lần lượt N từ, mỗi từ có độ dài lớn hơn 1 nhưng không quá 20, các từ có thể trùng nhau</w:t>
+        <w:t>Dòng thứ 2 ghi lần lượt N số nguyên dương, các số đều không quá 9 chữ số và có thể trùng nhau.</w:t>
       </w:r>
     </w:p>
     <w:p>
@@ -25459,6 +25658,8 @@
         <w:jc w:val="both"/>
         <w:rPr>
           <w:rFonts w:ascii="Times New Roman" w:hAnsi="Times New Roman" w:cs="Times New Roman"/>
+          <w:b/>
+          <w:bCs/>
           <w:sz w:val="26"/>
           <w:szCs w:val="26"/>
         </w:rPr>
@@ -25479,7 +25680,7 @@
           <w:sz w:val="26"/>
           <w:szCs w:val="26"/>
         </w:rPr>
-        <w:t>Ghi ra các từ khác nhau tạo được theo thứ tự từ điển</w:t>
+        <w:t>Ghi ra các dãy chữ số khác nhau tạo được theo thứ tự từ điển.</w:t>
       </w:r>
     </w:p>
     <w:p>
@@ -25493,87 +25694,14 @@
           <w:szCs w:val="26"/>
         </w:rPr>
       </w:pPr>
-    </w:p>
-    <w:p>
-      <w:pPr>
-        <w:spacing w:after="0" w:line="276" w:lineRule="auto"/>
-        <w:rPr>
-          <w:rFonts w:ascii="Times New Roman" w:hAnsi="Times New Roman" w:cs="Times New Roman"/>
-          <w:b/>
-          <w:bCs/>
-          <w:sz w:val="26"/>
-          <w:szCs w:val="26"/>
-        </w:rPr>
-      </w:pPr>
-    </w:p>
-    <w:p>
-      <w:pPr>
-        <w:spacing w:after="0" w:line="276" w:lineRule="auto"/>
-        <w:rPr>
-          <w:rFonts w:ascii="Times New Roman" w:hAnsi="Times New Roman" w:cs="Times New Roman"/>
-          <w:b/>
-          <w:bCs/>
-          <w:sz w:val="26"/>
-          <w:szCs w:val="26"/>
-        </w:rPr>
-      </w:pPr>
-    </w:p>
-    <w:p>
-      <w:pPr>
-        <w:spacing w:after="0" w:line="276" w:lineRule="auto"/>
-        <w:rPr>
-          <w:rFonts w:ascii="Times New Roman" w:hAnsi="Times New Roman" w:cs="Times New Roman"/>
-          <w:b/>
-          <w:bCs/>
-          <w:sz w:val="26"/>
-          <w:szCs w:val="26"/>
-        </w:rPr>
-      </w:pPr>
-    </w:p>
-    <w:p>
-      <w:pPr>
-        <w:spacing w:after="0" w:line="276" w:lineRule="auto"/>
-        <w:rPr>
-          <w:rFonts w:ascii="Times New Roman" w:hAnsi="Times New Roman" w:cs="Times New Roman"/>
-          <w:b/>
-          <w:bCs/>
-          <w:sz w:val="26"/>
-          <w:szCs w:val="26"/>
-        </w:rPr>
-      </w:pPr>
-    </w:p>
-    <w:p>
-      <w:pPr>
-        <w:spacing w:after="0" w:line="276" w:lineRule="auto"/>
-        <w:rPr>
-          <w:rFonts w:ascii="Times New Roman" w:hAnsi="Times New Roman" w:cs="Times New Roman"/>
-          <w:b/>
-          <w:bCs/>
-          <w:sz w:val="26"/>
-          <w:szCs w:val="26"/>
-        </w:rPr>
-      </w:pPr>
-    </w:p>
-    <w:p>
-      <w:pPr>
-        <w:spacing w:after="0" w:line="276" w:lineRule="auto"/>
-        <w:rPr>
-          <w:rFonts w:ascii="Times New Roman" w:hAnsi="Times New Roman" w:cs="Times New Roman"/>
-          <w:b/>
-          <w:bCs/>
-          <w:sz w:val="26"/>
-          <w:szCs w:val="26"/>
-        </w:rPr>
-      </w:pPr>
-      <w:r>
-        <w:rPr>
-          <w:rFonts w:ascii="Times New Roman" w:hAnsi="Times New Roman" w:cs="Times New Roman"/>
-          <w:b/>
-          <w:bCs/>
-          <w:sz w:val="26"/>
-          <w:szCs w:val="26"/>
-        </w:rPr>
-        <w:lastRenderedPageBreak/>
+      <w:r>
+        <w:rPr>
+          <w:rFonts w:ascii="Times New Roman" w:hAnsi="Times New Roman" w:cs="Times New Roman"/>
+          <w:b/>
+          <w:bCs/>
+          <w:sz w:val="26"/>
+          <w:szCs w:val="26"/>
+        </w:rPr>
         <w:t>Ví dụ</w:t>
       </w:r>
     </w:p>
@@ -25680,8 +25808,18 @@
                 <w:sz w:val="26"/>
                 <w:szCs w:val="26"/>
               </w:rPr>
-              <w:t>ABC BCA BAA ABB</w:t>
-            </w:r>
+              <w:t>123 231 211 122</w:t>
+            </w:r>
+          </w:p>
+          <w:p>
+            <w:pPr>
+              <w:spacing w:line="276" w:lineRule="auto"/>
+              <w:rPr>
+                <w:rFonts w:ascii="Times New Roman" w:hAnsi="Times New Roman" w:cs="Times New Roman"/>
+                <w:sz w:val="26"/>
+                <w:szCs w:val="26"/>
+              </w:rPr>
+            </w:pPr>
           </w:p>
         </w:tc>
         <w:tc>
@@ -25703,7 +25841,7 @@
                 <w:sz w:val="26"/>
                 <w:szCs w:val="26"/>
               </w:rPr>
-              <w:t>ABCABB</w:t>
+              <w:t>123122</w:t>
             </w:r>
           </w:p>
           <w:p>
@@ -25721,7 +25859,7 @@
                 <w:sz w:val="26"/>
                 <w:szCs w:val="26"/>
               </w:rPr>
-              <w:t>ABCBAA</w:t>
+              <w:t>123211</w:t>
             </w:r>
           </w:p>
           <w:p>
@@ -25739,7 +25877,7 @@
                 <w:sz w:val="26"/>
                 <w:szCs w:val="26"/>
               </w:rPr>
-              <w:t>ABCBCA</w:t>
+              <w:t>123231</w:t>
             </w:r>
           </w:p>
           <w:p>
@@ -25757,7 +25895,7 @@
                 <w:sz w:val="26"/>
                 <w:szCs w:val="26"/>
               </w:rPr>
-              <w:t>BAAABB</w:t>
+              <w:t>211122</w:t>
             </w:r>
           </w:p>
           <w:p>
@@ -25775,7 +25913,7 @@
                 <w:sz w:val="26"/>
                 <w:szCs w:val="26"/>
               </w:rPr>
-              <w:t>BCAABB</w:t>
+              <w:t>231122</w:t>
             </w:r>
           </w:p>
           <w:p>
@@ -25793,7 +25931,7 @@
                 <w:sz w:val="26"/>
                 <w:szCs w:val="26"/>
               </w:rPr>
-              <w:t>BCABAA</w:t>
+              <w:t>231211</w:t>
             </w:r>
           </w:p>
         </w:tc>
@@ -25812,11 +25950,8 @@
           <w:szCs w:val="26"/>
         </w:rPr>
       </w:pPr>
-    </w:p>
-    <w:p>
-      <w:pPr>
-        <w:pStyle w:val="Heading1"/>
-        <w:spacing w:before="0" w:after="0" w:line="276" w:lineRule="auto"/>
+      <w:bookmarkStart w:id="35" w:name="_Toc226470184"/>
+      <w:r>
         <w:rPr>
           <w:rFonts w:ascii="Times New Roman" w:hAnsi="Times New Roman" w:cs="Times New Roman"/>
           <w:b/>
@@ -25825,17 +25960,7 @@
           <w:sz w:val="26"/>
           <w:szCs w:val="26"/>
         </w:rPr>
-      </w:pPr>
-      <w:bookmarkStart w:id="35" w:name="_Toc226205059"/>
-      <w:r>
-        <w:rPr>
-          <w:rFonts w:ascii="Times New Roman" w:hAnsi="Times New Roman" w:cs="Times New Roman"/>
-          <w:b/>
-          <w:bCs/>
-          <w:color w:val="auto"/>
-          <w:sz w:val="26"/>
-          <w:szCs w:val="26"/>
-        </w:rPr>
+        <w:lastRenderedPageBreak/>
         <w:t xml:space="preserve">BÀI </w:t>
       </w:r>
       <w:r>
@@ -26470,7 +26595,7 @@
           <w:szCs w:val="26"/>
         </w:rPr>
       </w:pPr>
-      <w:bookmarkStart w:id="36" w:name="_Toc226205060"/>
+      <w:bookmarkStart w:id="36" w:name="_Toc226470185"/>
       <w:r>
         <w:rPr>
           <w:rFonts w:ascii="Times New Roman" w:hAnsi="Times New Roman" w:cs="Times New Roman"/>
@@ -27161,7 +27286,6 @@
                 <w:sz w:val="26"/>
                 <w:szCs w:val="26"/>
               </w:rPr>
-              <w:lastRenderedPageBreak/>
               <w:t>Input</w:t>
             </w:r>
           </w:p>
@@ -27401,7 +27525,7 @@
           <w:szCs w:val="26"/>
         </w:rPr>
       </w:pPr>
-      <w:bookmarkStart w:id="37" w:name="_Toc226205061"/>
+      <w:bookmarkStart w:id="37" w:name="_Toc226470186"/>
       <w:r>
         <w:rPr>
           <w:rFonts w:ascii="Times New Roman" w:hAnsi="Times New Roman" w:cs="Times New Roman"/>
@@ -27411,6 +27535,7 @@
           <w:sz w:val="26"/>
           <w:szCs w:val="26"/>
         </w:rPr>
+        <w:lastRenderedPageBreak/>
         <w:t>BÀI 3</w:t>
       </w:r>
       <w:r>
@@ -27838,6 +27963,18 @@
     </w:tbl>
     <w:p>
       <w:pPr>
+        <w:spacing w:after="0"/>
+        <w:rPr>
+          <w:rFonts w:ascii="Times New Roman" w:hAnsi="Times New Roman" w:cs="Times New Roman"/>
+          <w:b/>
+          <w:bCs/>
+          <w:sz w:val="26"/>
+          <w:szCs w:val="26"/>
+        </w:rPr>
+      </w:pPr>
+    </w:p>
+    <w:p>
+      <w:pPr>
         <w:pStyle w:val="Heading1"/>
         <w:spacing w:before="0" w:after="0" w:line="276" w:lineRule="auto"/>
         <w:rPr>
@@ -27849,7 +27986,7 @@
           <w:szCs w:val="26"/>
         </w:rPr>
       </w:pPr>
-      <w:bookmarkStart w:id="38" w:name="_Toc226205062"/>
+      <w:bookmarkStart w:id="38" w:name="_Toc226470187"/>
       <w:r>
         <w:rPr>
           <w:rFonts w:ascii="Times New Roman" w:hAnsi="Times New Roman" w:cs="Times New Roman"/>
@@ -28254,6 +28391,62 @@
     </w:tbl>
     <w:p>
       <w:pPr>
+        <w:rPr>
+          <w:rFonts w:ascii="Times New Roman" w:hAnsi="Times New Roman" w:cs="Times New Roman"/>
+          <w:b/>
+          <w:bCs/>
+          <w:sz w:val="26"/>
+          <w:szCs w:val="26"/>
+        </w:rPr>
+      </w:pPr>
+    </w:p>
+    <w:p>
+      <w:pPr>
+        <w:rPr>
+          <w:rFonts w:ascii="Times New Roman" w:hAnsi="Times New Roman" w:cs="Times New Roman"/>
+          <w:b/>
+          <w:bCs/>
+          <w:sz w:val="26"/>
+          <w:szCs w:val="26"/>
+        </w:rPr>
+      </w:pPr>
+    </w:p>
+    <w:p>
+      <w:pPr>
+        <w:rPr>
+          <w:rFonts w:ascii="Times New Roman" w:hAnsi="Times New Roman" w:cs="Times New Roman"/>
+          <w:b/>
+          <w:bCs/>
+          <w:sz w:val="26"/>
+          <w:szCs w:val="26"/>
+        </w:rPr>
+      </w:pPr>
+    </w:p>
+    <w:p>
+      <w:pPr>
+        <w:rPr>
+          <w:rFonts w:ascii="Times New Roman" w:hAnsi="Times New Roman" w:cs="Times New Roman"/>
+          <w:b/>
+          <w:bCs/>
+          <w:sz w:val="26"/>
+          <w:szCs w:val="26"/>
+        </w:rPr>
+      </w:pPr>
+    </w:p>
+    <w:p>
+      <w:pPr>
+        <w:spacing w:after="0"/>
+        <w:rPr>
+          <w:rFonts w:ascii="Times New Roman" w:hAnsi="Times New Roman" w:cs="Times New Roman"/>
+          <w:b/>
+          <w:bCs/>
+          <w:sz w:val="26"/>
+          <w:szCs w:val="26"/>
+        </w:rPr>
+      </w:pPr>
+    </w:p>
+    <w:p>
+      <w:pPr>
         <w:pStyle w:val="Heading1"/>
         <w:spacing w:before="0" w:after="0" w:line="276" w:lineRule="auto"/>
         <w:rPr>
@@ -28265,7 +28458,7 @@
           <w:szCs w:val="26"/>
         </w:rPr>
       </w:pPr>
-      <w:bookmarkStart w:id="39" w:name="_Toc226205063"/>
+      <w:bookmarkStart w:id="39" w:name="_Toc226470188"/>
       <w:r>
         <w:rPr>
           <w:rFonts w:ascii="Times New Roman" w:hAnsi="Times New Roman" w:cs="Times New Roman"/>
@@ -28587,7 +28780,7 @@
           <w:szCs w:val="26"/>
         </w:rPr>
       </w:pPr>
-      <w:bookmarkStart w:id="40" w:name="_Toc226205064"/>
+      <w:bookmarkStart w:id="40" w:name="_Toc226470189"/>
       <w:r>
         <w:rPr>
           <w:rFonts w:ascii="Times New Roman" w:hAnsi="Times New Roman" w:cs="Times New Roman"/>
@@ -28638,6 +28831,7 @@
       <w:pPr>
         <w:pStyle w:val="BodyText"/>
         <w:spacing w:before="0" w:line="276" w:lineRule="auto"/>
+        <w:ind w:left="0"/>
         <w:rPr>
           <w:lang w:val="en-US"/>
         </w:rPr>
@@ -28653,6 +28847,7 @@
       <w:pPr>
         <w:pStyle w:val="BodyText"/>
         <w:spacing w:before="0" w:line="276" w:lineRule="auto"/>
+        <w:ind w:left="0"/>
       </w:pPr>
       <w:r>
         <w:t>Hãy</w:t>
@@ -28836,6 +29031,7 @@
       <w:pPr>
         <w:pStyle w:val="BodyText"/>
         <w:spacing w:before="0" w:line="276" w:lineRule="auto"/>
+        <w:ind w:left="0"/>
       </w:pPr>
       <w:r>
         <w:rPr>
@@ -28960,6 +29156,7 @@
       <w:pPr>
         <w:pStyle w:val="BodyText"/>
         <w:spacing w:before="0" w:line="276" w:lineRule="auto"/>
+        <w:ind w:left="0"/>
       </w:pPr>
       <w:r>
         <w:rPr>
@@ -29122,7 +29319,6 @@
     <w:p>
       <w:pPr>
         <w:spacing w:after="0" w:line="276" w:lineRule="auto"/>
-        <w:ind w:left="144"/>
         <w:rPr>
           <w:rFonts w:ascii="Times New Roman" w:hAnsi="Times New Roman" w:cs="Times New Roman"/>
           <w:b/>
@@ -29162,8 +29358,8 @@
     </w:p>
     <w:tbl>
       <w:tblPr>
-        <w:tblW w:w="9494" w:type="dxa"/>
-        <w:tblInd w:w="137" w:type="dxa"/>
+        <w:tblW w:w="9639" w:type="dxa"/>
+        <w:tblInd w:w="-8" w:type="dxa"/>
         <w:tblBorders>
           <w:top w:val="single" w:sz="6" w:space="0" w:color="000000"/>
           <w:left w:val="single" w:sz="6" w:space="0" w:color="000000"/>
@@ -29180,7 +29376,7 @@
         <w:tblLook w:val="01E0" w:firstRow="1" w:lastRow="1" w:firstColumn="1" w:lastColumn="1" w:noHBand="0" w:noVBand="0"/>
       </w:tblPr>
       <w:tblGrid>
-        <w:gridCol w:w="4623"/>
+        <w:gridCol w:w="4768"/>
         <w:gridCol w:w="4871"/>
       </w:tblGrid>
       <w:tr>
@@ -29189,7 +29385,7 @@
         </w:trPr>
         <w:tc>
           <w:tcPr>
-            <w:tcW w:w="4623" w:type="dxa"/>
+            <w:tcW w:w="4768" w:type="dxa"/>
             <w:shd w:val="clear" w:color="auto" w:fill="ADADAD" w:themeFill="background2" w:themeFillShade="BF"/>
           </w:tcPr>
           <w:p>
@@ -29248,7 +29444,7 @@
         </w:trPr>
         <w:tc>
           <w:tcPr>
-            <w:tcW w:w="4623" w:type="dxa"/>
+            <w:tcW w:w="4768" w:type="dxa"/>
             <w:tcBorders>
               <w:bottom w:val="nil"/>
             </w:tcBorders>
@@ -29320,7 +29516,7 @@
         </w:trPr>
         <w:tc>
           <w:tcPr>
-            <w:tcW w:w="4623" w:type="dxa"/>
+            <w:tcW w:w="4768" w:type="dxa"/>
             <w:tcBorders>
               <w:top w:val="nil"/>
               <w:bottom w:val="nil"/>
@@ -29387,7 +29583,7 @@
         </w:trPr>
         <w:tc>
           <w:tcPr>
-            <w:tcW w:w="4623" w:type="dxa"/>
+            <w:tcW w:w="4768" w:type="dxa"/>
             <w:tcBorders>
               <w:top w:val="nil"/>
               <w:bottom w:val="nil"/>
@@ -29454,7 +29650,7 @@
         </w:trPr>
         <w:tc>
           <w:tcPr>
-            <w:tcW w:w="4623" w:type="dxa"/>
+            <w:tcW w:w="4768" w:type="dxa"/>
             <w:tcBorders>
               <w:top w:val="nil"/>
               <w:bottom w:val="nil"/>
@@ -29521,7 +29717,7 @@
         </w:trPr>
         <w:tc>
           <w:tcPr>
-            <w:tcW w:w="4623" w:type="dxa"/>
+            <w:tcW w:w="4768" w:type="dxa"/>
             <w:tcBorders>
               <w:top w:val="nil"/>
               <w:bottom w:val="nil"/>
@@ -29580,7 +29776,7 @@
         </w:trPr>
         <w:tc>
           <w:tcPr>
-            <w:tcW w:w="4623" w:type="dxa"/>
+            <w:tcW w:w="4768" w:type="dxa"/>
             <w:tcBorders>
               <w:top w:val="nil"/>
               <w:bottom w:val="nil"/>
@@ -29639,7 +29835,7 @@
         </w:trPr>
         <w:tc>
           <w:tcPr>
-            <w:tcW w:w="4623" w:type="dxa"/>
+            <w:tcW w:w="4768" w:type="dxa"/>
             <w:tcBorders>
               <w:top w:val="nil"/>
               <w:bottom w:val="nil"/>
@@ -29698,7 +29894,7 @@
         </w:trPr>
         <w:tc>
           <w:tcPr>
-            <w:tcW w:w="4623" w:type="dxa"/>
+            <w:tcW w:w="4768" w:type="dxa"/>
             <w:tcBorders>
               <w:top w:val="nil"/>
               <w:bottom w:val="nil"/>
@@ -29757,7 +29953,7 @@
         </w:trPr>
         <w:tc>
           <w:tcPr>
-            <w:tcW w:w="4623" w:type="dxa"/>
+            <w:tcW w:w="4768" w:type="dxa"/>
             <w:tcBorders>
               <w:top w:val="nil"/>
               <w:bottom w:val="nil"/>
@@ -29816,7 +30012,7 @@
         </w:trPr>
         <w:tc>
           <w:tcPr>
-            <w:tcW w:w="4623" w:type="dxa"/>
+            <w:tcW w:w="4768" w:type="dxa"/>
             <w:tcBorders>
               <w:top w:val="nil"/>
               <w:bottom w:val="nil"/>
@@ -29875,7 +30071,7 @@
         </w:trPr>
         <w:tc>
           <w:tcPr>
-            <w:tcW w:w="4623" w:type="dxa"/>
+            <w:tcW w:w="4768" w:type="dxa"/>
             <w:tcBorders>
               <w:top w:val="nil"/>
               <w:bottom w:val="nil"/>
@@ -29934,7 +30130,7 @@
         </w:trPr>
         <w:tc>
           <w:tcPr>
-            <w:tcW w:w="4623" w:type="dxa"/>
+            <w:tcW w:w="4768" w:type="dxa"/>
             <w:tcBorders>
               <w:top w:val="nil"/>
               <w:bottom w:val="nil"/>
@@ -29993,7 +30189,7 @@
         </w:trPr>
         <w:tc>
           <w:tcPr>
-            <w:tcW w:w="4623" w:type="dxa"/>
+            <w:tcW w:w="4768" w:type="dxa"/>
             <w:tcBorders>
               <w:top w:val="nil"/>
             </w:tcBorders>
@@ -30058,7 +30254,7 @@
           <w:szCs w:val="26"/>
         </w:rPr>
       </w:pPr>
-      <w:bookmarkStart w:id="41" w:name="_Toc226205065"/>
+      <w:bookmarkStart w:id="41" w:name="_Toc226470190"/>
       <w:r>
         <w:rPr>
           <w:rFonts w:ascii="Times New Roman" w:hAnsi="Times New Roman" w:cs="Times New Roman"/>
@@ -31064,7 +31260,7 @@
           <w:szCs w:val="26"/>
         </w:rPr>
       </w:pPr>
-      <w:bookmarkStart w:id="42" w:name="_Toc226205066"/>
+      <w:bookmarkStart w:id="42" w:name="_Toc226470191"/>
       <w:r>
         <w:rPr>
           <w:rFonts w:ascii="Times New Roman" w:hAnsi="Times New Roman" w:cs="Times New Roman"/>
@@ -32446,7 +32642,7 @@
           <w:szCs w:val="26"/>
         </w:rPr>
       </w:pPr>
-      <w:bookmarkStart w:id="43" w:name="_Toc226205067"/>
+      <w:bookmarkStart w:id="43" w:name="_Toc226470192"/>
       <w:r>
         <w:rPr>
           <w:rFonts w:ascii="Times New Roman" w:hAnsi="Times New Roman" w:cs="Times New Roman"/>
@@ -32885,7 +33081,7 @@
           <w:szCs w:val="26"/>
         </w:rPr>
       </w:pPr>
-      <w:bookmarkStart w:id="44" w:name="_Toc226205068"/>
+      <w:bookmarkStart w:id="44" w:name="_Toc226470193"/>
       <w:r>
         <w:rPr>
           <w:rFonts w:ascii="Times New Roman" w:hAnsi="Times New Roman" w:cs="Times New Roman"/>
@@ -32937,6 +33133,7 @@
         <w:pStyle w:val="BodyText"/>
         <w:spacing w:before="0" w:line="276" w:lineRule="auto"/>
         <w:ind w:left="0" w:right="113"/>
+        <w:jc w:val="both"/>
       </w:pPr>
       <w:r>
         <w:t>Cho</w:t>
@@ -33145,6 +33342,7 @@
         <w:pStyle w:val="BodyText"/>
         <w:spacing w:before="0" w:line="276" w:lineRule="auto"/>
         <w:ind w:left="0" w:right="113"/>
+        <w:jc w:val="both"/>
       </w:pPr>
       <w:r>
         <w:t>Hãy đếm xem có bao nhiêu tập con của tập N xâu kể trên khi ghép lại sẽ đầy đủ 26 chữ</w:t>
@@ -33194,7 +33392,13 @@
     </w:p>
     <w:p>
       <w:pPr>
+        <w:pStyle w:val="ListParagraph"/>
+        <w:numPr>
+          <w:ilvl w:val="0"/>
+          <w:numId w:val="10"/>
+        </w:numPr>
         <w:spacing w:after="0" w:line="276" w:lineRule="auto"/>
+        <w:jc w:val="both"/>
         <w:rPr>
           <w:rFonts w:ascii="Times New Roman" w:hAnsi="Times New Roman" w:cs="Times New Roman"/>
           <w:sz w:val="26"/>
@@ -33366,7 +33570,13 @@
     </w:p>
     <w:p>
       <w:pPr>
+        <w:pStyle w:val="ListParagraph"/>
+        <w:numPr>
+          <w:ilvl w:val="0"/>
+          <w:numId w:val="10"/>
+        </w:numPr>
         <w:spacing w:after="0" w:line="276" w:lineRule="auto"/>
+        <w:jc w:val="both"/>
         <w:rPr>
           <w:rFonts w:ascii="Times New Roman" w:hAnsi="Times New Roman" w:cs="Times New Roman"/>
           <w:sz w:val="26"/>
@@ -34494,7 +34704,7 @@
           <w:szCs w:val="26"/>
         </w:rPr>
       </w:pPr>
-      <w:bookmarkStart w:id="45" w:name="_Toc226205069"/>
+      <w:bookmarkStart w:id="45" w:name="_Toc226470194"/>
       <w:r>
         <w:rPr>
           <w:rFonts w:ascii="Times New Roman" w:hAnsi="Times New Roman" w:cs="Times New Roman"/>
@@ -34931,6 +35141,114 @@
     </w:p>
     <w:p>
       <w:pPr>
+        <w:spacing w:after="0" w:line="276" w:lineRule="auto"/>
+        <w:rPr>
+          <w:rFonts w:ascii="Times New Roman" w:hAnsi="Times New Roman" w:cs="Times New Roman"/>
+          <w:b/>
+          <w:bCs/>
+          <w:sz w:val="26"/>
+          <w:szCs w:val="26"/>
+        </w:rPr>
+      </w:pPr>
+    </w:p>
+    <w:p>
+      <w:pPr>
+        <w:spacing w:after="0" w:line="276" w:lineRule="auto"/>
+        <w:rPr>
+          <w:rFonts w:ascii="Times New Roman" w:hAnsi="Times New Roman" w:cs="Times New Roman"/>
+          <w:b/>
+          <w:bCs/>
+          <w:sz w:val="26"/>
+          <w:szCs w:val="26"/>
+        </w:rPr>
+      </w:pPr>
+    </w:p>
+    <w:p>
+      <w:pPr>
+        <w:spacing w:after="0" w:line="276" w:lineRule="auto"/>
+        <w:rPr>
+          <w:rFonts w:ascii="Times New Roman" w:hAnsi="Times New Roman" w:cs="Times New Roman"/>
+          <w:b/>
+          <w:bCs/>
+          <w:sz w:val="26"/>
+          <w:szCs w:val="26"/>
+        </w:rPr>
+      </w:pPr>
+    </w:p>
+    <w:p>
+      <w:pPr>
+        <w:spacing w:after="0" w:line="276" w:lineRule="auto"/>
+        <w:rPr>
+          <w:rFonts w:ascii="Times New Roman" w:hAnsi="Times New Roman" w:cs="Times New Roman"/>
+          <w:b/>
+          <w:bCs/>
+          <w:sz w:val="26"/>
+          <w:szCs w:val="26"/>
+        </w:rPr>
+      </w:pPr>
+    </w:p>
+    <w:p>
+      <w:pPr>
+        <w:spacing w:after="0" w:line="276" w:lineRule="auto"/>
+        <w:rPr>
+          <w:rFonts w:ascii="Times New Roman" w:hAnsi="Times New Roman" w:cs="Times New Roman"/>
+          <w:b/>
+          <w:bCs/>
+          <w:sz w:val="26"/>
+          <w:szCs w:val="26"/>
+        </w:rPr>
+      </w:pPr>
+    </w:p>
+    <w:p>
+      <w:pPr>
+        <w:spacing w:after="0" w:line="276" w:lineRule="auto"/>
+        <w:rPr>
+          <w:rFonts w:ascii="Times New Roman" w:hAnsi="Times New Roman" w:cs="Times New Roman"/>
+          <w:b/>
+          <w:bCs/>
+          <w:sz w:val="26"/>
+          <w:szCs w:val="26"/>
+        </w:rPr>
+      </w:pPr>
+    </w:p>
+    <w:p>
+      <w:pPr>
+        <w:spacing w:after="0" w:line="276" w:lineRule="auto"/>
+        <w:rPr>
+          <w:rFonts w:ascii="Times New Roman" w:hAnsi="Times New Roman" w:cs="Times New Roman"/>
+          <w:b/>
+          <w:bCs/>
+          <w:sz w:val="26"/>
+          <w:szCs w:val="26"/>
+        </w:rPr>
+      </w:pPr>
+    </w:p>
+    <w:p>
+      <w:pPr>
+        <w:spacing w:after="0" w:line="276" w:lineRule="auto"/>
+        <w:rPr>
+          <w:rFonts w:ascii="Times New Roman" w:hAnsi="Times New Roman" w:cs="Times New Roman"/>
+          <w:b/>
+          <w:bCs/>
+          <w:sz w:val="26"/>
+          <w:szCs w:val="26"/>
+        </w:rPr>
+      </w:pPr>
+    </w:p>
+    <w:p>
+      <w:pPr>
+        <w:spacing w:after="0" w:line="276" w:lineRule="auto"/>
+        <w:rPr>
+          <w:rFonts w:ascii="Times New Roman" w:hAnsi="Times New Roman" w:cs="Times New Roman"/>
+          <w:b/>
+          <w:bCs/>
+          <w:sz w:val="26"/>
+          <w:szCs w:val="26"/>
+        </w:rPr>
+      </w:pPr>
+    </w:p>
+    <w:p>
+      <w:pPr>
         <w:pStyle w:val="Heading1"/>
         <w:spacing w:before="0" w:after="0"/>
         <w:rPr>
@@ -34942,7 +35260,7 @@
           <w:szCs w:val="26"/>
         </w:rPr>
       </w:pPr>
-      <w:bookmarkStart w:id="46" w:name="_Toc226205070"/>
+      <w:bookmarkStart w:id="46" w:name="_Toc226470195"/>
       <w:r>
         <w:rPr>
           <w:rFonts w:ascii="Times New Roman" w:hAnsi="Times New Roman" w:cs="Times New Roman"/>
@@ -34952,6 +35270,7 @@
           <w:sz w:val="26"/>
           <w:szCs w:val="26"/>
         </w:rPr>
+        <w:lastRenderedPageBreak/>
         <w:t>BÀI 45. DSA_P483. XÂU TAM PHÂN CÓ N KÍ TỰ</w:t>
       </w:r>
       <w:bookmarkEnd w:id="46"/>
@@ -35187,7 +35506,6 @@
                 <w:sz w:val="26"/>
                 <w:szCs w:val="26"/>
               </w:rPr>
-              <w:lastRenderedPageBreak/>
               <w:t>Input</w:t>
             </w:r>
           </w:p>
@@ -35589,6 +35907,146 @@
     </w:p>
     <w:p>
       <w:pPr>
+        <w:spacing w:after="0" w:line="276" w:lineRule="auto"/>
+        <w:rPr>
+          <w:rFonts w:ascii="Times New Roman" w:hAnsi="Times New Roman" w:cs="Times New Roman"/>
+          <w:sz w:val="26"/>
+          <w:szCs w:val="26"/>
+        </w:rPr>
+      </w:pPr>
+    </w:p>
+    <w:p>
+      <w:pPr>
+        <w:spacing w:after="0" w:line="276" w:lineRule="auto"/>
+        <w:rPr>
+          <w:rFonts w:ascii="Times New Roman" w:hAnsi="Times New Roman" w:cs="Times New Roman"/>
+          <w:sz w:val="26"/>
+          <w:szCs w:val="26"/>
+        </w:rPr>
+      </w:pPr>
+    </w:p>
+    <w:p>
+      <w:pPr>
+        <w:spacing w:after="0" w:line="276" w:lineRule="auto"/>
+        <w:rPr>
+          <w:rFonts w:ascii="Times New Roman" w:hAnsi="Times New Roman" w:cs="Times New Roman"/>
+          <w:sz w:val="26"/>
+          <w:szCs w:val="26"/>
+        </w:rPr>
+      </w:pPr>
+    </w:p>
+    <w:p>
+      <w:pPr>
+        <w:spacing w:after="0" w:line="276" w:lineRule="auto"/>
+        <w:rPr>
+          <w:rFonts w:ascii="Times New Roman" w:hAnsi="Times New Roman" w:cs="Times New Roman"/>
+          <w:sz w:val="26"/>
+          <w:szCs w:val="26"/>
+        </w:rPr>
+      </w:pPr>
+    </w:p>
+    <w:p>
+      <w:pPr>
+        <w:spacing w:after="0" w:line="276" w:lineRule="auto"/>
+        <w:rPr>
+          <w:rFonts w:ascii="Times New Roman" w:hAnsi="Times New Roman" w:cs="Times New Roman"/>
+          <w:sz w:val="26"/>
+          <w:szCs w:val="26"/>
+        </w:rPr>
+      </w:pPr>
+    </w:p>
+    <w:p>
+      <w:pPr>
+        <w:spacing w:after="0" w:line="276" w:lineRule="auto"/>
+        <w:rPr>
+          <w:rFonts w:ascii="Times New Roman" w:hAnsi="Times New Roman" w:cs="Times New Roman"/>
+          <w:sz w:val="26"/>
+          <w:szCs w:val="26"/>
+        </w:rPr>
+      </w:pPr>
+    </w:p>
+    <w:p>
+      <w:pPr>
+        <w:spacing w:after="0" w:line="276" w:lineRule="auto"/>
+        <w:rPr>
+          <w:rFonts w:ascii="Times New Roman" w:hAnsi="Times New Roman" w:cs="Times New Roman"/>
+          <w:sz w:val="26"/>
+          <w:szCs w:val="26"/>
+        </w:rPr>
+      </w:pPr>
+    </w:p>
+    <w:p>
+      <w:pPr>
+        <w:spacing w:after="0" w:line="276" w:lineRule="auto"/>
+        <w:rPr>
+          <w:rFonts w:ascii="Times New Roman" w:hAnsi="Times New Roman" w:cs="Times New Roman"/>
+          <w:sz w:val="26"/>
+          <w:szCs w:val="26"/>
+        </w:rPr>
+      </w:pPr>
+    </w:p>
+    <w:p>
+      <w:pPr>
+        <w:spacing w:after="0" w:line="276" w:lineRule="auto"/>
+        <w:rPr>
+          <w:rFonts w:ascii="Times New Roman" w:hAnsi="Times New Roman" w:cs="Times New Roman"/>
+          <w:sz w:val="26"/>
+          <w:szCs w:val="26"/>
+        </w:rPr>
+      </w:pPr>
+    </w:p>
+    <w:p>
+      <w:pPr>
+        <w:spacing w:after="0" w:line="276" w:lineRule="auto"/>
+        <w:rPr>
+          <w:rFonts w:ascii="Times New Roman" w:hAnsi="Times New Roman" w:cs="Times New Roman"/>
+          <w:sz w:val="26"/>
+          <w:szCs w:val="26"/>
+        </w:rPr>
+      </w:pPr>
+    </w:p>
+    <w:p>
+      <w:pPr>
+        <w:spacing w:after="0" w:line="276" w:lineRule="auto"/>
+        <w:rPr>
+          <w:rFonts w:ascii="Times New Roman" w:hAnsi="Times New Roman" w:cs="Times New Roman"/>
+          <w:sz w:val="26"/>
+          <w:szCs w:val="26"/>
+        </w:rPr>
+      </w:pPr>
+    </w:p>
+    <w:p>
+      <w:pPr>
+        <w:spacing w:after="0" w:line="276" w:lineRule="auto"/>
+        <w:rPr>
+          <w:rFonts w:ascii="Times New Roman" w:hAnsi="Times New Roman" w:cs="Times New Roman"/>
+          <w:sz w:val="26"/>
+          <w:szCs w:val="26"/>
+        </w:rPr>
+      </w:pPr>
+    </w:p>
+    <w:p>
+      <w:pPr>
+        <w:spacing w:after="0" w:line="276" w:lineRule="auto"/>
+        <w:rPr>
+          <w:rFonts w:ascii="Times New Roman" w:hAnsi="Times New Roman" w:cs="Times New Roman"/>
+          <w:sz w:val="26"/>
+          <w:szCs w:val="26"/>
+        </w:rPr>
+      </w:pPr>
+    </w:p>
+    <w:p>
+      <w:pPr>
+        <w:spacing w:after="0" w:line="276" w:lineRule="auto"/>
+        <w:rPr>
+          <w:rFonts w:ascii="Times New Roman" w:hAnsi="Times New Roman" w:cs="Times New Roman"/>
+          <w:sz w:val="26"/>
+          <w:szCs w:val="26"/>
+        </w:rPr>
+      </w:pPr>
+    </w:p>
+    <w:p>
+      <w:pPr>
         <w:pStyle w:val="Heading1"/>
         <w:spacing w:before="0" w:after="0"/>
         <w:rPr>
@@ -35600,7 +36058,7 @@
           <w:szCs w:val="26"/>
         </w:rPr>
       </w:pPr>
-      <w:bookmarkStart w:id="47" w:name="_Toc226205071"/>
+      <w:bookmarkStart w:id="47" w:name="_Toc226470196"/>
       <w:r>
         <w:rPr>
           <w:rFonts w:ascii="Times New Roman" w:hAnsi="Times New Roman" w:cs="Times New Roman"/>
@@ -35610,6 +36068,7 @@
           <w:sz w:val="26"/>
           <w:szCs w:val="26"/>
         </w:rPr>
+        <w:lastRenderedPageBreak/>
         <w:t xml:space="preserve">BÀI 46. DSA_P496. </w:t>
       </w:r>
       <w:r>
@@ -36208,7 +36667,6 @@
                 <w:sz w:val="26"/>
                 <w:szCs w:val="26"/>
               </w:rPr>
-              <w:lastRenderedPageBreak/>
               <w:t>5535</w:t>
             </w:r>
           </w:p>
@@ -36276,7 +36734,7 @@
           <w:szCs w:val="26"/>
         </w:rPr>
       </w:pPr>
-      <w:bookmarkStart w:id="48" w:name="_Toc226205072"/>
+      <w:bookmarkStart w:id="48" w:name="_Toc226470197"/>
       <w:r>
         <w:rPr>
           <w:rFonts w:ascii="Times New Roman" w:hAnsi="Times New Roman" w:cs="Times New Roman"/>
@@ -36595,7 +37053,7 @@
           <w:szCs w:val="26"/>
         </w:rPr>
       </w:pPr>
-      <w:bookmarkStart w:id="49" w:name="_Toc226205073"/>
+      <w:bookmarkStart w:id="49" w:name="_Toc226470198"/>
       <w:r>
         <w:rPr>
           <w:rFonts w:ascii="Times New Roman" w:hAnsi="Times New Roman" w:cs="Times New Roman"/>
@@ -36694,6 +37152,7 @@
           <w:sz w:val="26"/>
           <w:szCs w:val="26"/>
         </w:rPr>
+        <w:lastRenderedPageBreak/>
         <w:t>Output</w:t>
       </w:r>
       <w:r>
@@ -36914,7 +37373,7 @@
           <w:szCs w:val="26"/>
         </w:rPr>
       </w:pPr>
-      <w:bookmarkStart w:id="50" w:name="_Toc226205074"/>
+      <w:bookmarkStart w:id="50" w:name="_Toc226470199"/>
       <w:r>
         <w:rPr>
           <w:rFonts w:ascii="Times New Roman" w:hAnsi="Times New Roman" w:cs="Times New Roman"/>
@@ -36964,6 +37423,7 @@
     <w:p>
       <w:pPr>
         <w:spacing w:after="0" w:line="276" w:lineRule="auto"/>
+        <w:jc w:val="both"/>
         <w:rPr>
           <w:rFonts w:ascii="Times New Roman" w:hAnsi="Times New Roman" w:cs="Times New Roman"/>
           <w:sz w:val="26"/>
@@ -36998,6 +37458,7 @@
     <w:p>
       <w:pPr>
         <w:spacing w:after="0" w:line="276" w:lineRule="auto"/>
+        <w:jc w:val="both"/>
         <w:rPr>
           <w:rFonts w:ascii="Times New Roman" w:hAnsi="Times New Roman" w:cs="Times New Roman"/>
           <w:sz w:val="26"/>
@@ -37632,7 +38093,6 @@
         <w:spacing w:after="0" w:line="276" w:lineRule="auto"/>
         <w:rPr>
           <w:rFonts w:ascii="Times New Roman" w:hAnsi="Times New Roman" w:cs="Times New Roman"/>
-          <w:b/>
           <w:sz w:val="26"/>
         </w:rPr>
       </w:pPr>
@@ -37669,6 +38129,16 @@
         </w:rPr>
         <w:t>Trong test 1, 3 tập con thoả mãn là: [2, 5], [4, 3] và [3, 4]</w:t>
       </w:r>
+    </w:p>
+    <w:p>
+      <w:pPr>
+        <w:spacing w:after="0" w:line="276" w:lineRule="auto"/>
+        <w:rPr>
+          <w:rFonts w:ascii="Times New Roman" w:hAnsi="Times New Roman" w:cs="Times New Roman"/>
+          <w:b/>
+          <w:sz w:val="26"/>
+        </w:rPr>
+      </w:pPr>
     </w:p>
     <w:p>
       <w:pPr>
@@ -37683,7 +38153,7 @@
           <w:szCs w:val="26"/>
         </w:rPr>
       </w:pPr>
-      <w:bookmarkStart w:id="51" w:name="_Toc226205075"/>
+      <w:bookmarkStart w:id="51" w:name="_Toc226470200"/>
       <w:r>
         <w:rPr>
           <w:rFonts w:ascii="Times New Roman" w:hAnsi="Times New Roman" w:cs="Times New Roman"/>
@@ -37693,7 +38163,6 @@
           <w:sz w:val="26"/>
           <w:szCs w:val="26"/>
         </w:rPr>
-        <w:lastRenderedPageBreak/>
         <w:t xml:space="preserve">BÀI </w:t>
       </w:r>
       <w:r>
@@ -37987,14 +38456,54 @@
           <w:szCs w:val="26"/>
         </w:rPr>
       </w:pPr>
-      <w:r>
-        <w:rPr>
-          <w:rFonts w:ascii="Times New Roman" w:hAnsi="Times New Roman" w:cs="Times New Roman"/>
-          <w:b/>
-          <w:bCs/>
-          <w:sz w:val="26"/>
-          <w:szCs w:val="26"/>
-        </w:rPr>
+    </w:p>
+    <w:p>
+      <w:pPr>
+        <w:spacing w:after="0" w:line="276" w:lineRule="auto"/>
+        <w:jc w:val="both"/>
+        <w:rPr>
+          <w:rFonts w:ascii="Times New Roman" w:hAnsi="Times New Roman" w:cs="Times New Roman"/>
+          <w:b/>
+          <w:bCs/>
+          <w:sz w:val="26"/>
+          <w:szCs w:val="26"/>
+        </w:rPr>
+      </w:pPr>
+    </w:p>
+    <w:p>
+      <w:pPr>
+        <w:spacing w:after="0" w:line="276" w:lineRule="auto"/>
+        <w:jc w:val="both"/>
+        <w:rPr>
+          <w:rFonts w:ascii="Times New Roman" w:hAnsi="Times New Roman" w:cs="Times New Roman"/>
+          <w:b/>
+          <w:bCs/>
+          <w:sz w:val="26"/>
+          <w:szCs w:val="26"/>
+        </w:rPr>
+      </w:pPr>
+    </w:p>
+    <w:p>
+      <w:pPr>
+        <w:spacing w:after="0" w:line="276" w:lineRule="auto"/>
+        <w:jc w:val="both"/>
+        <w:rPr>
+          <w:rFonts w:ascii="Times New Roman" w:hAnsi="Times New Roman" w:cs="Times New Roman"/>
+          <w:b/>
+          <w:bCs/>
+          <w:sz w:val="26"/>
+          <w:szCs w:val="26"/>
+        </w:rPr>
+      </w:pPr>
+      <w:r>
+        <w:rPr>
+          <w:rFonts w:ascii="Times New Roman" w:hAnsi="Times New Roman" w:cs="Times New Roman"/>
+          <w:b/>
+          <w:bCs/>
+          <w:sz w:val="26"/>
+          <w:szCs w:val="26"/>
+        </w:rPr>
+        <w:lastRenderedPageBreak/>
         <w:t>Ví dụ</w:t>
       </w:r>
     </w:p>
@@ -38413,7 +38922,7 @@
           <w:szCs w:val="26"/>
         </w:rPr>
       </w:pPr>
-      <w:bookmarkStart w:id="52" w:name="_Toc226205076"/>
+      <w:bookmarkStart w:id="52" w:name="_Toc226470201"/>
       <w:r>
         <w:rPr>
           <w:rFonts w:ascii="Times New Roman" w:hAnsi="Times New Roman" w:cs="Times New Roman"/>
@@ -39164,7 +39673,6 @@
                 <w:sz w:val="26"/>
                 <w:szCs w:val="26"/>
               </w:rPr>
-              <w:lastRenderedPageBreak/>
               <w:t>9: ACC</w:t>
             </w:r>
           </w:p>
@@ -39347,6 +39855,30 @@
     </w:p>
     <w:p>
       <w:pPr>
+        <w:spacing w:after="0"/>
+        <w:rPr>
+          <w:rFonts w:ascii="Times New Roman" w:hAnsi="Times New Roman" w:cs="Times New Roman"/>
+          <w:b/>
+          <w:bCs/>
+          <w:sz w:val="26"/>
+          <w:szCs w:val="26"/>
+        </w:rPr>
+      </w:pPr>
+    </w:p>
+    <w:p>
+      <w:pPr>
+        <w:spacing w:after="0"/>
+        <w:rPr>
+          <w:rFonts w:ascii="Times New Roman" w:hAnsi="Times New Roman" w:cs="Times New Roman"/>
+          <w:b/>
+          <w:bCs/>
+          <w:sz w:val="26"/>
+          <w:szCs w:val="26"/>
+        </w:rPr>
+      </w:pPr>
+    </w:p>
+    <w:p>
+      <w:pPr>
         <w:pStyle w:val="Heading1"/>
         <w:spacing w:before="0" w:after="0"/>
         <w:rPr>
@@ -39358,7 +39890,7 @@
           <w:szCs w:val="26"/>
         </w:rPr>
       </w:pPr>
-      <w:bookmarkStart w:id="53" w:name="_Toc226205077"/>
+      <w:bookmarkStart w:id="53" w:name="_Toc226470202"/>
       <w:r>
         <w:rPr>
           <w:rFonts w:ascii="Times New Roman" w:hAnsi="Times New Roman" w:cs="Times New Roman"/>
@@ -39368,6 +39900,7 @@
           <w:sz w:val="26"/>
           <w:szCs w:val="26"/>
         </w:rPr>
+        <w:lastRenderedPageBreak/>
         <w:t xml:space="preserve">BÀI </w:t>
       </w:r>
       <w:r>
@@ -39828,6 +40361,466 @@
         </w:tc>
       </w:tr>
     </w:tbl>
+    <w:p>
+      <w:pPr>
+        <w:spacing w:after="0" w:line="276" w:lineRule="auto"/>
+        <w:jc w:val="both"/>
+        <w:rPr>
+          <w:rFonts w:ascii="Times New Roman" w:hAnsi="Times New Roman" w:cs="Times New Roman"/>
+          <w:sz w:val="26"/>
+          <w:szCs w:val="26"/>
+        </w:rPr>
+      </w:pPr>
+    </w:p>
+    <w:p>
+      <w:pPr>
+        <w:pStyle w:val="Heading1"/>
+        <w:spacing w:before="0" w:after="0"/>
+        <w:rPr>
+          <w:rFonts w:ascii="Times New Roman" w:hAnsi="Times New Roman" w:cs="Times New Roman"/>
+          <w:b/>
+          <w:bCs/>
+          <w:color w:val="auto"/>
+          <w:sz w:val="26"/>
+          <w:szCs w:val="26"/>
+        </w:rPr>
+      </w:pPr>
+      <w:bookmarkStart w:id="54" w:name="_Toc226470203"/>
+      <w:r>
+        <w:rPr>
+          <w:rFonts w:ascii="Times New Roman" w:hAnsi="Times New Roman" w:cs="Times New Roman"/>
+          <w:b/>
+          <w:bCs/>
+          <w:color w:val="auto"/>
+          <w:sz w:val="26"/>
+          <w:szCs w:val="26"/>
+        </w:rPr>
+        <w:t>BÀI 53. XÂU NHỊ PHÂN CÓ NHIỀU HƠN K BIT 1</w:t>
+      </w:r>
+      <w:bookmarkEnd w:id="54"/>
+    </w:p>
+    <w:p>
+      <w:pPr>
+        <w:spacing w:after="0" w:line="276" w:lineRule="auto"/>
+        <w:jc w:val="both"/>
+        <w:rPr>
+          <w:rFonts w:ascii="Times New Roman" w:hAnsi="Times New Roman" w:cs="Times New Roman"/>
+          <w:sz w:val="26"/>
+          <w:szCs w:val="26"/>
+        </w:rPr>
+      </w:pPr>
+      <w:r>
+        <w:rPr>
+          <w:rFonts w:ascii="Times New Roman" w:hAnsi="Times New Roman" w:cs="Times New Roman"/>
+          <w:sz w:val="26"/>
+          <w:szCs w:val="26"/>
+        </w:rPr>
+        <w:t xml:space="preserve">Cho hai số nguyên dương N và K. Hãy liệt kê tất cả các </w:t>
+      </w:r>
+      <w:r>
+        <w:rPr>
+          <w:rFonts w:ascii="Times New Roman" w:hAnsi="Times New Roman" w:cs="Times New Roman"/>
+          <w:sz w:val="26"/>
+          <w:szCs w:val="26"/>
+        </w:rPr>
+        <w:t>dãy</w:t>
+      </w:r>
+      <w:r>
+        <w:rPr>
+          <w:rFonts w:ascii="Times New Roman" w:hAnsi="Times New Roman" w:cs="Times New Roman"/>
+          <w:sz w:val="26"/>
+          <w:szCs w:val="26"/>
+        </w:rPr>
+        <w:t xml:space="preserve"> nhị phân trong đó có </w:t>
+      </w:r>
+      <w:r>
+        <w:rPr>
+          <w:rFonts w:ascii="Times New Roman" w:hAnsi="Times New Roman" w:cs="Times New Roman"/>
+          <w:sz w:val="26"/>
+          <w:szCs w:val="26"/>
+        </w:rPr>
+        <w:t xml:space="preserve">xuất hiện </w:t>
+      </w:r>
+      <w:r>
+        <w:rPr>
+          <w:rFonts w:ascii="Times New Roman" w:hAnsi="Times New Roman" w:cs="Times New Roman"/>
+          <w:b/>
+          <w:bCs/>
+          <w:sz w:val="26"/>
+          <w:szCs w:val="26"/>
+        </w:rPr>
+        <w:t>ít nhất</w:t>
+      </w:r>
+      <w:r>
+        <w:rPr>
+          <w:rFonts w:ascii="Times New Roman" w:hAnsi="Times New Roman" w:cs="Times New Roman"/>
+          <w:sz w:val="26"/>
+          <w:szCs w:val="26"/>
+        </w:rPr>
+        <w:t xml:space="preserve"> một dãy </w:t>
+      </w:r>
+      <w:r>
+        <w:rPr>
+          <w:rFonts w:ascii="Times New Roman" w:hAnsi="Times New Roman" w:cs="Times New Roman"/>
+          <w:sz w:val="26"/>
+          <w:szCs w:val="26"/>
+        </w:rPr>
+        <w:t xml:space="preserve">có </w:t>
+      </w:r>
+      <w:r>
+        <w:rPr>
+          <w:rFonts w:ascii="Times New Roman" w:hAnsi="Times New Roman" w:cs="Times New Roman"/>
+          <w:b/>
+          <w:bCs/>
+          <w:sz w:val="26"/>
+          <w:szCs w:val="26"/>
+        </w:rPr>
+        <w:t>nhiều hơn</w:t>
+      </w:r>
+      <w:r>
+        <w:rPr>
+          <w:rFonts w:ascii="Times New Roman" w:hAnsi="Times New Roman" w:cs="Times New Roman"/>
+          <w:sz w:val="26"/>
+          <w:szCs w:val="26"/>
+        </w:rPr>
+        <w:t xml:space="preserve"> K số 1 liên tiếp.</w:t>
+      </w:r>
+    </w:p>
+    <w:p>
+      <w:pPr>
+        <w:spacing w:after="0" w:line="276" w:lineRule="auto"/>
+        <w:jc w:val="both"/>
+        <w:rPr>
+          <w:rFonts w:ascii="Times New Roman" w:hAnsi="Times New Roman" w:cs="Times New Roman"/>
+          <w:sz w:val="26"/>
+          <w:szCs w:val="26"/>
+        </w:rPr>
+      </w:pPr>
+      <w:r>
+        <w:rPr>
+          <w:rFonts w:ascii="Times New Roman" w:hAnsi="Times New Roman" w:cs="Times New Roman"/>
+          <w:b/>
+          <w:bCs/>
+          <w:sz w:val="26"/>
+          <w:szCs w:val="26"/>
+        </w:rPr>
+        <w:t>Input:</w:t>
+      </w:r>
+      <w:r>
+        <w:rPr>
+          <w:rFonts w:ascii="Times New Roman" w:hAnsi="Times New Roman" w:cs="Times New Roman"/>
+          <w:sz w:val="26"/>
+          <w:szCs w:val="26"/>
+        </w:rPr>
+        <w:t xml:space="preserve"> Chỉ có 1 dòng ghi hai số N và K. Trong đó 2 &lt; N &lt; 20; 1 &lt; K &lt; N.</w:t>
+      </w:r>
+    </w:p>
+    <w:p>
+      <w:pPr>
+        <w:pStyle w:val="BodyText"/>
+        <w:spacing w:before="0" w:line="276" w:lineRule="auto"/>
+        <w:ind w:left="0"/>
+        <w:rPr>
+          <w:lang w:val="en-US"/>
+        </w:rPr>
+      </w:pPr>
+      <w:r>
+        <w:rPr>
+          <w:b/>
+        </w:rPr>
+        <w:t>Output:</w:t>
+      </w:r>
+      <w:r>
+        <w:rPr>
+          <w:b/>
+          <w:spacing w:val="-2"/>
+        </w:rPr>
+        <w:t xml:space="preserve"> </w:t>
+      </w:r>
+      <w:r>
+        <w:rPr>
+          <w:lang w:val="en-US"/>
+        </w:rPr>
+        <w:t xml:space="preserve">Ghi ra tất cả các </w:t>
+      </w:r>
+      <w:r>
+        <w:rPr>
+          <w:lang w:val="en-US"/>
+        </w:rPr>
+        <w:t>dãy</w:t>
+      </w:r>
+      <w:r>
+        <w:rPr>
+          <w:lang w:val="en-US"/>
+        </w:rPr>
+        <w:t xml:space="preserve"> nhị phân thoả mãn yêu cầu của đề bài theo thứ tự từ điển, mỗi </w:t>
+      </w:r>
+      <w:r>
+        <w:rPr>
+          <w:lang w:val="en-US"/>
+        </w:rPr>
+        <w:t>dãy</w:t>
+      </w:r>
+      <w:r>
+        <w:rPr>
+          <w:lang w:val="en-US"/>
+        </w:rPr>
+        <w:t xml:space="preserve"> trên một dòng</w:t>
+      </w:r>
+      <w:r>
+        <w:rPr>
+          <w:lang w:val="en-US"/>
+        </w:rPr>
+        <w:t>, trong đó các ký tự 0 và 1 viết liền nhau.</w:t>
+      </w:r>
+    </w:p>
+    <w:p>
+      <w:pPr>
+        <w:spacing w:after="0" w:line="276" w:lineRule="auto"/>
+        <w:rPr>
+          <w:rFonts w:ascii="Times New Roman" w:hAnsi="Times New Roman" w:cs="Times New Roman"/>
+          <w:b/>
+          <w:sz w:val="26"/>
+          <w:szCs w:val="26"/>
+        </w:rPr>
+      </w:pPr>
+      <w:r>
+        <w:rPr>
+          <w:rFonts w:ascii="Times New Roman" w:hAnsi="Times New Roman" w:cs="Times New Roman"/>
+          <w:b/>
+          <w:sz w:val="26"/>
+          <w:szCs w:val="26"/>
+        </w:rPr>
+        <w:t>Ví</w:t>
+      </w:r>
+      <w:r>
+        <w:rPr>
+          <w:rFonts w:ascii="Times New Roman" w:hAnsi="Times New Roman" w:cs="Times New Roman"/>
+          <w:b/>
+          <w:spacing w:val="-4"/>
+          <w:sz w:val="26"/>
+          <w:szCs w:val="26"/>
+        </w:rPr>
+        <w:t xml:space="preserve"> </w:t>
+      </w:r>
+      <w:r>
+        <w:rPr>
+          <w:rFonts w:ascii="Times New Roman" w:hAnsi="Times New Roman" w:cs="Times New Roman"/>
+          <w:b/>
+          <w:spacing w:val="-5"/>
+          <w:sz w:val="26"/>
+          <w:szCs w:val="26"/>
+        </w:rPr>
+        <w:t>dụ:</w:t>
+      </w:r>
+    </w:p>
+    <w:tbl>
+      <w:tblPr>
+        <w:tblStyle w:val="TableGrid"/>
+        <w:tblW w:w="0" w:type="auto"/>
+        <w:tblLook w:val="04A0" w:firstRow="1" w:lastRow="0" w:firstColumn="1" w:lastColumn="0" w:noHBand="0" w:noVBand="1"/>
+      </w:tblPr>
+      <w:tblGrid>
+        <w:gridCol w:w="4814"/>
+        <w:gridCol w:w="4815"/>
+      </w:tblGrid>
+      <w:tr>
+        <w:tc>
+          <w:tcPr>
+            <w:tcW w:w="4814" w:type="dxa"/>
+            <w:shd w:val="clear" w:color="auto" w:fill="ADADAD" w:themeFill="background2" w:themeFillShade="BF"/>
+          </w:tcPr>
+          <w:p>
+            <w:pPr>
+              <w:spacing w:line="276" w:lineRule="auto"/>
+              <w:rPr>
+                <w:rFonts w:ascii="Times New Roman" w:hAnsi="Times New Roman" w:cs="Times New Roman"/>
+                <w:b/>
+                <w:bCs/>
+                <w:sz w:val="26"/>
+                <w:szCs w:val="26"/>
+              </w:rPr>
+            </w:pPr>
+            <w:r>
+              <w:rPr>
+                <w:rFonts w:ascii="Times New Roman" w:hAnsi="Times New Roman" w:cs="Times New Roman"/>
+                <w:b/>
+                <w:bCs/>
+                <w:sz w:val="26"/>
+                <w:szCs w:val="26"/>
+              </w:rPr>
+              <w:t>Input</w:t>
+            </w:r>
+          </w:p>
+        </w:tc>
+        <w:tc>
+          <w:tcPr>
+            <w:tcW w:w="4815" w:type="dxa"/>
+            <w:shd w:val="clear" w:color="auto" w:fill="ADADAD" w:themeFill="background2" w:themeFillShade="BF"/>
+          </w:tcPr>
+          <w:p>
+            <w:pPr>
+              <w:spacing w:line="276" w:lineRule="auto"/>
+              <w:rPr>
+                <w:rFonts w:ascii="Times New Roman" w:hAnsi="Times New Roman" w:cs="Times New Roman"/>
+                <w:b/>
+                <w:bCs/>
+                <w:sz w:val="26"/>
+                <w:szCs w:val="26"/>
+              </w:rPr>
+            </w:pPr>
+            <w:r>
+              <w:rPr>
+                <w:rFonts w:ascii="Times New Roman" w:hAnsi="Times New Roman" w:cs="Times New Roman"/>
+                <w:b/>
+                <w:bCs/>
+                <w:sz w:val="26"/>
+                <w:szCs w:val="26"/>
+              </w:rPr>
+              <w:t>Output</w:t>
+            </w:r>
+          </w:p>
+        </w:tc>
+      </w:tr>
+      <w:tr>
+        <w:tc>
+          <w:tcPr>
+            <w:tcW w:w="4814" w:type="dxa"/>
+          </w:tcPr>
+          <w:p>
+            <w:pPr>
+              <w:spacing w:line="276" w:lineRule="auto"/>
+              <w:rPr>
+                <w:rFonts w:ascii="Times New Roman" w:hAnsi="Times New Roman" w:cs="Times New Roman"/>
+                <w:sz w:val="26"/>
+                <w:szCs w:val="26"/>
+              </w:rPr>
+            </w:pPr>
+            <w:r>
+              <w:rPr>
+                <w:rFonts w:ascii="Times New Roman" w:hAnsi="Times New Roman" w:cs="Times New Roman"/>
+                <w:sz w:val="26"/>
+                <w:szCs w:val="26"/>
+              </w:rPr>
+              <w:t>5 3</w:t>
+            </w:r>
+          </w:p>
+        </w:tc>
+        <w:tc>
+          <w:tcPr>
+            <w:tcW w:w="4815" w:type="dxa"/>
+          </w:tcPr>
+          <w:p>
+            <w:pPr>
+              <w:spacing w:line="276" w:lineRule="auto"/>
+              <w:rPr>
+                <w:rFonts w:ascii="Times New Roman" w:hAnsi="Times New Roman" w:cs="Times New Roman"/>
+                <w:sz w:val="26"/>
+                <w:szCs w:val="26"/>
+              </w:rPr>
+            </w:pPr>
+            <w:r>
+              <w:rPr>
+                <w:rFonts w:ascii="Times New Roman" w:hAnsi="Times New Roman" w:cs="Times New Roman"/>
+                <w:sz w:val="26"/>
+                <w:szCs w:val="26"/>
+              </w:rPr>
+              <w:t>01111</w:t>
+            </w:r>
+          </w:p>
+          <w:p>
+            <w:pPr>
+              <w:spacing w:line="276" w:lineRule="auto"/>
+              <w:rPr>
+                <w:rFonts w:ascii="Times New Roman" w:hAnsi="Times New Roman" w:cs="Times New Roman"/>
+                <w:sz w:val="26"/>
+                <w:szCs w:val="26"/>
+              </w:rPr>
+            </w:pPr>
+            <w:r>
+              <w:rPr>
+                <w:rFonts w:ascii="Times New Roman" w:hAnsi="Times New Roman" w:cs="Times New Roman"/>
+                <w:sz w:val="26"/>
+                <w:szCs w:val="26"/>
+              </w:rPr>
+              <w:t>11110</w:t>
+            </w:r>
+          </w:p>
+          <w:p>
+            <w:pPr>
+              <w:spacing w:line="276" w:lineRule="auto"/>
+              <w:rPr>
+                <w:rFonts w:ascii="Times New Roman" w:hAnsi="Times New Roman" w:cs="Times New Roman"/>
+                <w:sz w:val="26"/>
+                <w:szCs w:val="26"/>
+              </w:rPr>
+            </w:pPr>
+            <w:r>
+              <w:rPr>
+                <w:rFonts w:ascii="Times New Roman" w:hAnsi="Times New Roman" w:cs="Times New Roman"/>
+                <w:sz w:val="26"/>
+                <w:szCs w:val="26"/>
+              </w:rPr>
+              <w:t>11111</w:t>
+            </w:r>
+          </w:p>
+        </w:tc>
+      </w:tr>
+    </w:tbl>
+    <w:p>
+      <w:pPr>
+        <w:pStyle w:val="BodyText"/>
+        <w:spacing w:before="0" w:line="276" w:lineRule="auto"/>
+        <w:ind w:left="0"/>
+        <w:rPr>
+          <w:lang w:val="en-US"/>
+        </w:rPr>
+      </w:pPr>
+    </w:p>
+    <w:p>
+      <w:pPr>
+        <w:spacing w:after="0" w:line="276" w:lineRule="auto"/>
+        <w:jc w:val="both"/>
+        <w:rPr>
+          <w:rFonts w:ascii="Times New Roman" w:hAnsi="Times New Roman" w:cs="Times New Roman"/>
+          <w:sz w:val="26"/>
+          <w:szCs w:val="26"/>
+        </w:rPr>
+      </w:pPr>
+    </w:p>
+    <w:p>
+      <w:pPr>
+        <w:spacing w:after="0" w:line="276" w:lineRule="auto"/>
+        <w:jc w:val="both"/>
+        <w:rPr>
+          <w:rFonts w:ascii="Times New Roman" w:hAnsi="Times New Roman" w:cs="Times New Roman"/>
+          <w:sz w:val="26"/>
+          <w:szCs w:val="26"/>
+        </w:rPr>
+      </w:pPr>
+    </w:p>
+    <w:p>
+      <w:pPr>
+        <w:spacing w:after="0" w:line="276" w:lineRule="auto"/>
+        <w:jc w:val="both"/>
+        <w:rPr>
+          <w:rFonts w:ascii="Times New Roman" w:hAnsi="Times New Roman" w:cs="Times New Roman"/>
+          <w:sz w:val="26"/>
+          <w:szCs w:val="26"/>
+        </w:rPr>
+      </w:pPr>
+    </w:p>
+    <w:p>
+      <w:pPr>
+        <w:spacing w:after="0" w:line="276" w:lineRule="auto"/>
+        <w:jc w:val="both"/>
+        <w:rPr>
+          <w:rFonts w:ascii="Times New Roman" w:hAnsi="Times New Roman" w:cs="Times New Roman"/>
+          <w:sz w:val="26"/>
+          <w:szCs w:val="26"/>
+        </w:rPr>
+      </w:pPr>
+    </w:p>
     <w:p>
       <w:pPr>
         <w:spacing w:after="0" w:line="276" w:lineRule="auto"/>
@@ -42063,7 +43056,7 @@
   <w:style w:type="paragraph" w:default="1" w:styleId="Normal">
     <w:name w:val="Normal"/>
     <w:qFormat/>
-    <w:rsid w:val="002E07D0"/>
+    <w:rsid w:val="00D76CC7"/>
   </w:style>
   <w:style w:type="paragraph" w:styleId="Heading1">
     <w:name w:val="heading 1"/>
@@ -42266,7 +43259,6 @@
   <w:style w:type="character" w:default="1" w:styleId="DefaultParagraphFont">
     <w:name w:val="Default Paragraph Font"/>
     <w:uiPriority w:val="1"/>
-    <w:semiHidden/>
     <w:unhideWhenUsed/>
   </w:style>
   <w:style w:type="table" w:default="1" w:styleId="TableNormal">

</xml_diff>